<commit_message>
Add portfolio link to resume assets
</commit_message>
<xml_diff>
--- a/src/assets/resumes/Hyunwoo_Park_Resume.docx
+++ b/src/assets/resumes/Hyunwoo_Park_Resume.docx
@@ -54,7 +54,7 @@
         </w:tabs>
         <w:spacing w:after="0" w:line="276" w:lineRule="auto"/>
         <w:rPr>
-          <w:rFonts w:ascii="Arial" w:hAnsi="Arial" w:cs="Arial"/>
+          <w:rFonts w:ascii="Arial" w:hAnsi="Arial" w:cs="Arial" w:hint="eastAsia"/>
         </w:rPr>
       </w:pPr>
       <w:r>
@@ -95,9 +95,9 @@
       </w:r>
       <w:r>
         <w:rPr>
-          <w:rFonts w:ascii="Arial" w:hAnsi="Arial" w:cs="Arial"/>
-        </w:rPr>
-        <w:t>hp5817@rit.edu</w:t>
+          <w:rFonts w:ascii="Arial" w:hAnsi="Arial" w:cs="Arial" w:hint="eastAsia"/>
+        </w:rPr>
+        <w:t>qkrgus7799@gmail.com</w:t>
       </w:r>
     </w:p>
     <w:p>
@@ -124,39 +124,35 @@
             <w:rStyle w:val="Hyperlink"/>
             <w:rFonts w:ascii="Arial" w:hAnsi="Arial" w:cs="Arial"/>
           </w:rPr>
-          <w:t>linkedin.com/in/</w:t>
+          <w:t>linkedin.com/in/hyunwoo-park-rit/</w:t>
         </w:r>
-        <w:proofErr w:type="spellStart"/>
+      </w:hyperlink>
+    </w:p>
+    <w:p>
+      <w:pPr>
+        <w:tabs>
+          <w:tab w:val="right" w:pos="720"/>
+          <w:tab w:val="right" w:pos="9360"/>
+          <w:tab w:val="right" w:pos="31680"/>
+        </w:tabs>
+        <w:spacing w:after="0" w:line="276" w:lineRule="auto"/>
+        <w:rPr>
+          <w:rFonts w:ascii="Arial" w:hAnsi="Arial" w:cs="Arial"/>
+        </w:rPr>
+      </w:pPr>
+      <w:r>
+        <w:sym w:font="Webdings" w:char="F0E3"/>
+      </w:r>
+      <w:r>
+        <w:t xml:space="preserve"> </w:t>
+      </w:r>
+      <w:hyperlink r:id="rId6" w:history="1">
         <w:r>
           <w:rPr>
             <w:rStyle w:val="Hyperlink"/>
             <w:rFonts w:ascii="Arial" w:hAnsi="Arial" w:cs="Arial"/>
           </w:rPr>
-          <w:t>hyunwoo</w:t>
-        </w:r>
-        <w:proofErr w:type="spellEnd"/>
-        <w:r>
-          <w:rPr>
-            <w:rStyle w:val="Hyperlink"/>
-            <w:rFonts w:ascii="Arial" w:hAnsi="Arial" w:cs="Arial"/>
-          </w:rPr>
-          <w:t>-park-</w:t>
-        </w:r>
-        <w:proofErr w:type="spellStart"/>
-        <w:r>
-          <w:rPr>
-            <w:rStyle w:val="Hyperlink"/>
-            <w:rFonts w:ascii="Arial" w:hAnsi="Arial" w:cs="Arial"/>
-          </w:rPr>
-          <w:t>rit</w:t>
-        </w:r>
-        <w:proofErr w:type="spellEnd"/>
-        <w:r>
-          <w:rPr>
-            <w:rStyle w:val="Hyperlink"/>
-            <w:rFonts w:ascii="Arial" w:hAnsi="Arial" w:cs="Arial"/>
-          </w:rPr>
-          <w:t>/</w:t>
+          <w:t>hyunwoo-park-portfolio.vercel.app</w:t>
         </w:r>
       </w:hyperlink>
     </w:p>
@@ -420,7 +416,7 @@
         </w:tabs>
         <w:spacing w:after="0" w:line="276" w:lineRule="auto"/>
         <w:rPr>
-          <w:rFonts w:ascii="Arial" w:hAnsi="Arial" w:cs="Arial" w:hint="eastAsia"/>
+          <w:rFonts w:ascii="Arial" w:hAnsi="Arial" w:cs="Arial"/>
         </w:rPr>
       </w:pPr>
       <w:r>
@@ -433,21 +429,7 @@
         <w:rPr>
           <w:rFonts w:ascii="Arial" w:hAnsi="Arial" w:cs="Arial" w:hint="eastAsia"/>
         </w:rPr>
-        <w:t xml:space="preserve">, Fall 2023, </w:t>
-      </w:r>
-      <w:proofErr w:type="gramStart"/>
-      <w:r>
-        <w:rPr>
-          <w:rFonts w:ascii="Arial" w:hAnsi="Arial" w:cs="Arial" w:hint="eastAsia"/>
-        </w:rPr>
-        <w:t>Spring</w:t>
-      </w:r>
-      <w:proofErr w:type="gramEnd"/>
-      <w:r>
-        <w:rPr>
-          <w:rFonts w:ascii="Arial" w:hAnsi="Arial" w:cs="Arial" w:hint="eastAsia"/>
-        </w:rPr>
-        <w:t xml:space="preserve"> 2024, Fall 2024, Fall 2025</w:t>
+        <w:t>, Fall 2023, Spring 2024, Fall 2024, Fall 2025</w:t>
       </w:r>
     </w:p>
     <w:p>
@@ -687,7 +669,7 @@
         </w:tabs>
         <w:spacing w:after="0" w:line="276" w:lineRule="auto"/>
         <w:rPr>
-          <w:rFonts w:ascii="Arial" w:hAnsi="Arial" w:cs="Arial" w:hint="eastAsia"/>
+          <w:rFonts w:ascii="Arial" w:hAnsi="Arial" w:cs="Arial"/>
         </w:rPr>
       </w:pPr>
       <w:r>
@@ -750,7 +732,7 @@
         </w:tabs>
         <w:spacing w:after="0" w:line="276" w:lineRule="auto"/>
         <w:rPr>
-          <w:rFonts w:ascii="Arial" w:hAnsi="Arial" w:cs="Arial" w:hint="eastAsia"/>
+          <w:rFonts w:ascii="Arial" w:hAnsi="Arial" w:cs="Arial"/>
         </w:rPr>
       </w:pPr>
       <w:r>
@@ -801,7 +783,7 @@
         </w:tabs>
         <w:spacing w:after="0" w:line="276" w:lineRule="auto"/>
         <w:rPr>
-          <w:rFonts w:ascii="Arial" w:hAnsi="Arial" w:cs="Arial" w:hint="eastAsia"/>
+          <w:rFonts w:ascii="Arial" w:hAnsi="Arial" w:cs="Arial"/>
         </w:rPr>
       </w:pPr>
       <w:r>
@@ -878,7 +860,7 @@
         </w:tabs>
         <w:spacing w:after="0" w:line="276" w:lineRule="auto"/>
         <w:rPr>
-          <w:rFonts w:ascii="Arial" w:hAnsi="Arial" w:cs="Arial" w:hint="eastAsia"/>
+          <w:rFonts w:ascii="Arial" w:hAnsi="Arial" w:cs="Arial"/>
         </w:rPr>
       </w:pPr>
       <w:r>
@@ -1021,21 +1003,7 @@
         <w:rPr>
           <w:rFonts w:ascii="Arial" w:hAnsi="Arial" w:cs="Arial"/>
         </w:rPr>
-        <w:t xml:space="preserve">Modified existing game systems using </w:t>
-      </w:r>
-      <w:proofErr w:type="spellStart"/>
-      <w:r>
-        <w:rPr>
-          <w:rFonts w:ascii="Arial" w:hAnsi="Arial" w:cs="Arial"/>
-        </w:rPr>
-        <w:t>ETGMod</w:t>
-      </w:r>
-      <w:proofErr w:type="spellEnd"/>
-      <w:r>
-        <w:rPr>
-          <w:rFonts w:ascii="Arial" w:hAnsi="Arial" w:cs="Arial"/>
-        </w:rPr>
-        <w:t xml:space="preserve"> to integrate custom input, movement, and animation behavior.</w:t>
+        <w:t>Modified existing game systems using ETGMod to integrate custom input, movement, and animation behavior.</w:t>
       </w:r>
     </w:p>
     <w:p>
@@ -1046,7 +1014,7 @@
         </w:tabs>
         <w:spacing w:after="0" w:line="276" w:lineRule="auto"/>
         <w:rPr>
-          <w:rFonts w:ascii="Arial" w:hAnsi="Arial" w:cs="Arial" w:hint="eastAsia"/>
+          <w:rFonts w:ascii="Arial" w:hAnsi="Arial" w:cs="Arial"/>
         </w:rPr>
       </w:pPr>
       <w:r>
@@ -1065,23 +1033,13 @@
         </w:rPr>
         <w:t xml:space="preserve"> — </w:t>
       </w:r>
-      <w:proofErr w:type="spellStart"/>
-      <w:r>
-        <w:rPr>
-          <w:rFonts w:ascii="Arial" w:hAnsi="Arial" w:cs="Arial" w:hint="eastAsia"/>
-          <w:b/>
-          <w:bCs/>
-        </w:rPr>
-        <w:t>Hyperdeath</w:t>
-      </w:r>
-      <w:proofErr w:type="spellEnd"/>
-      <w:r>
-        <w:rPr>
-          <w:rFonts w:ascii="Arial" w:hAnsi="Arial" w:cs="Arial" w:hint="eastAsia"/>
-          <w:b/>
-          <w:bCs/>
-        </w:rPr>
-        <w:t xml:space="preserve"> Robotika</w:t>
+      <w:r>
+        <w:rPr>
+          <w:rFonts w:ascii="Arial" w:hAnsi="Arial" w:cs="Arial" w:hint="eastAsia"/>
+          <w:b/>
+          <w:bCs/>
+        </w:rPr>
+        <w:t>Hyperdeath Robotika</w:t>
       </w:r>
       <w:r>
         <w:rPr>
@@ -1208,7 +1166,7 @@
         </w:tabs>
         <w:spacing w:after="0" w:line="276" w:lineRule="auto"/>
         <w:rPr>
-          <w:rFonts w:ascii="Arial" w:hAnsi="Arial" w:cs="Arial" w:hint="eastAsia"/>
+          <w:rFonts w:ascii="Arial" w:hAnsi="Arial" w:cs="Arial"/>
         </w:rPr>
       </w:pPr>
       <w:r>
@@ -1309,21 +1267,7 @@
         <w:rPr>
           <w:rFonts w:ascii="Arial" w:hAnsi="Arial" w:cs="Arial"/>
         </w:rPr>
-        <w:t xml:space="preserve"> </w:t>
-      </w:r>
-      <w:proofErr w:type="spellStart"/>
-      <w:r>
-        <w:rPr>
-          <w:rFonts w:ascii="Arial" w:hAnsi="Arial" w:cs="Arial"/>
-        </w:rPr>
-        <w:t>tModLoader</w:t>
-      </w:r>
-      <w:proofErr w:type="spellEnd"/>
-      <w:r>
-        <w:rPr>
-          <w:rFonts w:ascii="Arial" w:hAnsi="Arial" w:cs="Arial"/>
-        </w:rPr>
-        <w:t xml:space="preserve"> </w:t>
+        <w:t xml:space="preserve"> tModLoader </w:t>
       </w:r>
       <w:r>
         <w:rPr>
@@ -1383,19 +1327,7 @@
         <w:rPr>
           <w:rFonts w:ascii="Arial" w:hAnsi="Arial" w:cs="Arial"/>
         </w:rPr>
-        <w:t xml:space="preserve"> AI for NPCs and </w:t>
-      </w:r>
-      <w:r>
-        <w:rPr>
-          <w:rFonts w:ascii="Arial" w:hAnsi="Arial" w:cs="Arial"/>
-        </w:rPr>
-        <w:t>bosses</w:t>
-      </w:r>
-      <w:r>
-        <w:rPr>
-          <w:rFonts w:ascii="Arial" w:hAnsi="Arial" w:cs="Arial"/>
-        </w:rPr>
-        <w:t>, including attack logic and animation control.</w:t>
+        <w:t xml:space="preserve"> AI for NPCs and bosses, including attack logic and animation control.</w:t>
       </w:r>
     </w:p>
     <w:p>
@@ -1470,7 +1402,7 @@
         <w:spacing w:after="0" w:line="276" w:lineRule="auto"/>
         <w:jc w:val="right"/>
         <w:rPr>
-          <w:rFonts w:ascii="Arial" w:hAnsi="Arial" w:cs="Arial" w:hint="eastAsia"/>
+          <w:rFonts w:ascii="Arial" w:hAnsi="Arial" w:cs="Arial"/>
         </w:rPr>
       </w:pPr>
       <w:r>
@@ -1541,7 +1473,7 @@
         <w:spacing w:after="0" w:line="276" w:lineRule="auto"/>
         <w:jc w:val="right"/>
         <w:rPr>
-          <w:rFonts w:ascii="Arial" w:hAnsi="Arial" w:cs="Arial" w:hint="eastAsia"/>
+          <w:rFonts w:ascii="Arial" w:hAnsi="Arial" w:cs="Arial"/>
         </w:rPr>
       </w:pPr>
       <w:r>
@@ -2547,6 +2479,7 @@
   <w:style w:type="character" w:default="1" w:styleId="DefaultParagraphFont">
     <w:name w:val="Default Paragraph Font"/>
     <w:uiPriority w:val="1"/>
+    <w:semiHidden/>
     <w:unhideWhenUsed/>
   </w:style>
   <w:style w:type="table" w:default="1" w:styleId="TableNormal">

</xml_diff>

<commit_message>
Update resume assets and preview layout
</commit_message>
<xml_diff>
--- a/src/assets/resumes/Hyunwoo_Park_Resume.docx
+++ b/src/assets/resumes/Hyunwoo_Park_Resume.docx
@@ -54,7 +54,7 @@
         </w:tabs>
         <w:spacing w:after="0" w:line="276" w:lineRule="auto"/>
         <w:rPr>
-          <w:rFonts w:ascii="Arial" w:hAnsi="Arial" w:cs="Arial" w:hint="eastAsia"/>
+          <w:rFonts w:ascii="Arial" w:hAnsi="Arial" w:cs="Arial"/>
         </w:rPr>
       </w:pPr>
       <w:r>
@@ -124,36 +124,86 @@
             <w:rStyle w:val="Hyperlink"/>
             <w:rFonts w:ascii="Arial" w:hAnsi="Arial" w:cs="Arial"/>
           </w:rPr>
-          <w:t>linkedin.com/in/hyunwoo-park-rit/</w:t>
+          <w:t>linkedin.com/in/</w:t>
         </w:r>
-      </w:hyperlink>
-    </w:p>
-    <w:p>
-      <w:pPr>
-        <w:tabs>
-          <w:tab w:val="right" w:pos="720"/>
-          <w:tab w:val="right" w:pos="9360"/>
-          <w:tab w:val="right" w:pos="31680"/>
-        </w:tabs>
-        <w:spacing w:after="0" w:line="276" w:lineRule="auto"/>
-        <w:rPr>
-          <w:rFonts w:ascii="Arial" w:hAnsi="Arial" w:cs="Arial"/>
-        </w:rPr>
-      </w:pPr>
-      <w:r>
-        <w:sym w:font="Webdings" w:char="F0E3"/>
-      </w:r>
-      <w:r>
-        <w:t xml:space="preserve"> </w:t>
-      </w:r>
-      <w:hyperlink r:id="rId6" w:history="1">
+        <w:proofErr w:type="spellStart"/>
         <w:r>
           <w:rPr>
             <w:rStyle w:val="Hyperlink"/>
             <w:rFonts w:ascii="Arial" w:hAnsi="Arial" w:cs="Arial"/>
           </w:rPr>
-          <w:t>hyunwoo-park-portfolio.vercel.app</w:t>
+          <w:t>hyunwoo</w:t>
         </w:r>
+        <w:proofErr w:type="spellEnd"/>
+        <w:r>
+          <w:rPr>
+            <w:rStyle w:val="Hyperlink"/>
+            <w:rFonts w:ascii="Arial" w:hAnsi="Arial" w:cs="Arial"/>
+          </w:rPr>
+          <w:t>-park-</w:t>
+        </w:r>
+        <w:proofErr w:type="spellStart"/>
+        <w:r>
+          <w:rPr>
+            <w:rStyle w:val="Hyperlink"/>
+            <w:rFonts w:ascii="Arial" w:hAnsi="Arial" w:cs="Arial"/>
+          </w:rPr>
+          <w:t>rit</w:t>
+        </w:r>
+        <w:proofErr w:type="spellEnd"/>
+        <w:r>
+          <w:rPr>
+            <w:rStyle w:val="Hyperlink"/>
+            <w:rFonts w:ascii="Arial" w:hAnsi="Arial" w:cs="Arial"/>
+          </w:rPr>
+          <w:t>/</w:t>
+        </w:r>
+      </w:hyperlink>
+    </w:p>
+    <w:p>
+      <w:pPr>
+        <w:tabs>
+          <w:tab w:val="right" w:pos="720"/>
+          <w:tab w:val="right" w:pos="9360"/>
+          <w:tab w:val="right" w:pos="31680"/>
+        </w:tabs>
+        <w:spacing w:after="0" w:line="276" w:lineRule="auto"/>
+        <w:rPr>
+          <w:rFonts w:ascii="Arial" w:hAnsi="Arial" w:cs="Arial"/>
+        </w:rPr>
+      </w:pPr>
+      <w:r>
+        <w:sym w:font="Webdings" w:char="F0E3"/>
+      </w:r>
+      <w:r>
+        <w:t xml:space="preserve"> </w:t>
+      </w:r>
+      <w:hyperlink r:id="rId6" w:history="1">
+        <w:proofErr w:type="spellStart"/>
+        <w:r>
+          <w:rPr>
+            <w:rStyle w:val="Hyperlink"/>
+            <w:rFonts w:ascii="Arial" w:hAnsi="Arial" w:cs="Arial"/>
+          </w:rPr>
+          <w:t>hyunwoo</w:t>
+        </w:r>
+        <w:proofErr w:type="spellEnd"/>
+        <w:r>
+          <w:rPr>
+            <w:rStyle w:val="Hyperlink"/>
+            <w:rFonts w:ascii="Arial" w:hAnsi="Arial" w:cs="Arial"/>
+          </w:rPr>
+          <w:t>-park-</w:t>
+        </w:r>
+        <w:proofErr w:type="spellStart"/>
+        <w:r>
+          <w:rPr>
+            <w:rStyle w:val="Hyperlink"/>
+            <w:rFonts w:ascii="Arial" w:hAnsi="Arial" w:cs="Arial"/>
+          </w:rPr>
+          <w:t>portfolio.vercel.app</w:t>
+        </w:r>
+        <w:proofErr w:type="spellEnd"/>
       </w:hyperlink>
     </w:p>
     <w:p>
@@ -429,7 +479,21 @@
         <w:rPr>
           <w:rFonts w:ascii="Arial" w:hAnsi="Arial" w:cs="Arial" w:hint="eastAsia"/>
         </w:rPr>
-        <w:t>, Fall 2023, Spring 2024, Fall 2024, Fall 2025</w:t>
+        <w:t xml:space="preserve">, Fall 2023, </w:t>
+      </w:r>
+      <w:proofErr w:type="gramStart"/>
+      <w:r>
+        <w:rPr>
+          <w:rFonts w:ascii="Arial" w:hAnsi="Arial" w:cs="Arial" w:hint="eastAsia"/>
+        </w:rPr>
+        <w:t>Spring</w:t>
+      </w:r>
+      <w:proofErr w:type="gramEnd"/>
+      <w:r>
+        <w:rPr>
+          <w:rFonts w:ascii="Arial" w:hAnsi="Arial" w:cs="Arial" w:hint="eastAsia"/>
+        </w:rPr>
+        <w:t xml:space="preserve"> 2024, Fall 2024, Fall 2025</w:t>
       </w:r>
     </w:p>
     <w:p>
@@ -615,204 +679,611 @@
         <w:t>SKILLS</w:t>
       </w:r>
     </w:p>
-    <w:p>
-      <w:pPr>
-        <w:tabs>
-          <w:tab w:val="right" w:pos="720"/>
-          <w:tab w:val="right" w:pos="9360"/>
-          <w:tab w:val="right" w:pos="31680"/>
-        </w:tabs>
-        <w:spacing w:after="0" w:line="276" w:lineRule="auto"/>
-        <w:rPr>
-          <w:rFonts w:ascii="Arial" w:hAnsi="Arial" w:cs="Arial"/>
-        </w:rPr>
-      </w:pPr>
-      <w:r>
-        <w:rPr>
-          <w:rFonts w:ascii="Arial" w:hAnsi="Arial" w:cs="Arial"/>
-          <w:b/>
-          <w:bCs/>
-        </w:rPr>
-        <w:t>Programming Languages</w:t>
-      </w:r>
-      <w:r>
-        <w:rPr>
-          <w:rFonts w:ascii="Arial" w:hAnsi="Arial" w:cs="Arial"/>
-        </w:rPr>
-        <w:t xml:space="preserve">: </w:t>
-      </w:r>
-      <w:r>
-        <w:rPr>
-          <w:rFonts w:ascii="Arial" w:hAnsi="Arial" w:cs="Arial"/>
-        </w:rPr>
-        <w:t xml:space="preserve">C#, C++, </w:t>
-      </w:r>
-      <w:r>
-        <w:rPr>
-          <w:rFonts w:ascii="Arial" w:hAnsi="Arial" w:cs="Arial"/>
-        </w:rPr>
-        <w:t>JavaScript, HTML</w:t>
-      </w:r>
-      <w:r>
-        <w:rPr>
-          <w:rFonts w:ascii="Arial" w:hAnsi="Arial" w:cs="Arial"/>
-        </w:rPr>
-        <w:t>, CSS</w:t>
-      </w:r>
-    </w:p>
-    <w:p>
-      <w:pPr>
-        <w:tabs>
-          <w:tab w:val="right" w:pos="720"/>
-          <w:tab w:val="right" w:pos="9360"/>
-          <w:tab w:val="right" w:pos="31680"/>
-        </w:tabs>
-        <w:spacing w:after="0" w:line="276" w:lineRule="auto"/>
-        <w:rPr>
-          <w:rFonts w:ascii="Arial" w:hAnsi="Arial" w:cs="Arial"/>
-        </w:rPr>
-      </w:pPr>
-      <w:r>
-        <w:rPr>
-          <w:rFonts w:ascii="Arial" w:hAnsi="Arial" w:cs="Arial" w:hint="eastAsia"/>
-          <w:b/>
-          <w:bCs/>
-        </w:rPr>
-        <w:t>Game Development</w:t>
-      </w:r>
-      <w:r>
-        <w:rPr>
-          <w:rFonts w:ascii="Arial" w:hAnsi="Arial" w:cs="Arial" w:hint="eastAsia"/>
-        </w:rPr>
-        <w:t xml:space="preserve">: Unity, </w:t>
-      </w:r>
-      <w:r>
-        <w:rPr>
-          <w:rFonts w:ascii="Arial" w:hAnsi="Arial" w:cs="Arial" w:hint="eastAsia"/>
-        </w:rPr>
-        <w:t xml:space="preserve">Gameplay Programming, </w:t>
-      </w:r>
-      <w:r>
-        <w:rPr>
-          <w:rFonts w:ascii="Arial" w:hAnsi="Arial" w:cs="Arial" w:hint="eastAsia"/>
-        </w:rPr>
-        <w:t xml:space="preserve">AI, Pathfinding, Physics, </w:t>
-      </w:r>
-      <w:r>
-        <w:rPr>
-          <w:rFonts w:ascii="Arial" w:hAnsi="Arial" w:cs="Arial" w:hint="eastAsia"/>
-        </w:rPr>
-        <w:t>UI</w:t>
-      </w:r>
-      <w:r>
-        <w:rPr>
-          <w:rFonts w:ascii="Arial" w:hAnsi="Arial" w:cs="Arial" w:hint="eastAsia"/>
-        </w:rPr>
-        <w:t xml:space="preserve">, File I/O, </w:t>
-      </w:r>
-      <w:r>
-        <w:rPr>
-          <w:rFonts w:ascii="Arial" w:hAnsi="Arial" w:cs="Arial" w:hint="eastAsia"/>
-        </w:rPr>
-        <w:t>OOP</w:t>
-      </w:r>
-      <w:r>
-        <w:rPr>
-          <w:rFonts w:ascii="Arial" w:hAnsi="Arial" w:cs="Arial" w:hint="eastAsia"/>
-        </w:rPr>
-        <w:t>, Debugging</w:t>
-      </w:r>
-    </w:p>
-    <w:p>
-      <w:pPr>
-        <w:tabs>
-          <w:tab w:val="right" w:pos="720"/>
-          <w:tab w:val="right" w:pos="9360"/>
-          <w:tab w:val="right" w:pos="31680"/>
-        </w:tabs>
-        <w:spacing w:after="0" w:line="276" w:lineRule="auto"/>
-        <w:rPr>
-          <w:rFonts w:ascii="Arial" w:hAnsi="Arial" w:cs="Arial"/>
-        </w:rPr>
-      </w:pPr>
-      <w:r>
-        <w:rPr>
-          <w:rFonts w:ascii="Arial" w:hAnsi="Arial" w:cs="Arial" w:hint="eastAsia"/>
-          <w:b/>
-          <w:bCs/>
-        </w:rPr>
-        <w:t>Technologies</w:t>
-      </w:r>
-      <w:r>
-        <w:rPr>
-          <w:rFonts w:ascii="Arial" w:hAnsi="Arial" w:cs="Arial" w:hint="eastAsia"/>
-        </w:rPr>
-        <w:t xml:space="preserve">: Git, GitHub, Visual Studio, </w:t>
-      </w:r>
-      <w:r>
-        <w:rPr>
-          <w:rFonts w:ascii="Arial" w:hAnsi="Arial" w:cs="Arial" w:hint="eastAsia"/>
-        </w:rPr>
-        <w:t>VS</w:t>
-      </w:r>
-      <w:r>
-        <w:rPr>
-          <w:rFonts w:ascii="Arial" w:hAnsi="Arial" w:cs="Arial" w:hint="eastAsia"/>
-        </w:rPr>
-        <w:t xml:space="preserve"> Code</w:t>
-      </w:r>
-      <w:r>
-        <w:rPr>
-          <w:rFonts w:ascii="Arial" w:hAnsi="Arial" w:cs="Arial" w:hint="eastAsia"/>
-        </w:rPr>
-        <w:t xml:space="preserve">, </w:t>
-      </w:r>
-      <w:r>
-        <w:rPr>
-          <w:rFonts w:ascii="Arial" w:hAnsi="Arial" w:cs="Arial" w:hint="eastAsia"/>
-        </w:rPr>
-        <w:t>Sensor Integration, Serial Communication</w:t>
-      </w:r>
-    </w:p>
-    <w:p>
-      <w:pPr>
-        <w:tabs>
-          <w:tab w:val="right" w:pos="720"/>
-          <w:tab w:val="right" w:pos="9360"/>
-          <w:tab w:val="right" w:pos="31680"/>
-        </w:tabs>
-        <w:spacing w:after="0" w:line="276" w:lineRule="auto"/>
-        <w:rPr>
-          <w:rFonts w:ascii="Arial" w:hAnsi="Arial" w:cs="Arial"/>
-        </w:rPr>
-      </w:pPr>
-      <w:r>
-        <w:rPr>
-          <w:rFonts w:ascii="Arial" w:hAnsi="Arial" w:cs="Arial" w:hint="eastAsia"/>
-          <w:b/>
-          <w:bCs/>
-        </w:rPr>
-        <w:t>Tools</w:t>
-      </w:r>
-      <w:r>
-        <w:rPr>
-          <w:rFonts w:ascii="Arial" w:hAnsi="Arial" w:cs="Arial" w:hint="eastAsia"/>
-        </w:rPr>
-        <w:t xml:space="preserve">: </w:t>
-      </w:r>
-      <w:r>
-        <w:rPr>
-          <w:rFonts w:ascii="Arial" w:hAnsi="Arial" w:cs="Arial" w:hint="eastAsia"/>
-        </w:rPr>
-        <w:t>Photoshop, Maya</w:t>
-      </w:r>
-      <w:r>
-        <w:rPr>
-          <w:rFonts w:ascii="Arial" w:hAnsi="Arial" w:cs="Arial" w:hint="eastAsia"/>
-        </w:rPr>
-        <w:t>, SolidWorks</w:t>
-      </w:r>
-    </w:p>
+    <w:tbl>
+      <w:tblPr>
+        <w:tblStyle w:val="TableGrid"/>
+        <w:tblW w:w="0" w:type="auto"/>
+        <w:tblBorders>
+          <w:top w:val="none" w:sz="0" w:space="0" w:color="auto"/>
+          <w:left w:val="none" w:sz="0" w:space="0" w:color="auto"/>
+          <w:bottom w:val="none" w:sz="0" w:space="0" w:color="auto"/>
+          <w:right w:val="none" w:sz="0" w:space="0" w:color="auto"/>
+          <w:insideH w:val="none" w:sz="0" w:space="0" w:color="auto"/>
+          <w:insideV w:val="none" w:sz="0" w:space="0" w:color="auto"/>
+        </w:tblBorders>
+        <w:tblLook w:val="04A0" w:firstRow="1" w:lastRow="0" w:firstColumn="1" w:lastColumn="0" w:noHBand="0" w:noVBand="1"/>
+      </w:tblPr>
+      <w:tblGrid>
+        <w:gridCol w:w="2697"/>
+        <w:gridCol w:w="2697"/>
+        <w:gridCol w:w="2698"/>
+        <w:gridCol w:w="2698"/>
+      </w:tblGrid>
+      <w:tr>
+        <w:tc>
+          <w:tcPr>
+            <w:tcW w:w="2697" w:type="dxa"/>
+          </w:tcPr>
+          <w:p>
+            <w:pPr>
+              <w:tabs>
+                <w:tab w:val="right" w:pos="720"/>
+                <w:tab w:val="right" w:pos="9360"/>
+                <w:tab w:val="right" w:pos="31680"/>
+              </w:tabs>
+              <w:spacing w:line="276" w:lineRule="auto"/>
+              <w:rPr>
+                <w:rFonts w:ascii="Arial" w:hAnsi="Arial" w:cs="Arial" w:hint="eastAsia"/>
+              </w:rPr>
+            </w:pPr>
+            <w:r>
+              <w:rPr>
+                <w:rFonts w:ascii="Arial" w:hAnsi="Arial" w:cs="Arial"/>
+              </w:rPr>
+              <w:t>•</w:t>
+            </w:r>
+            <w:r>
+              <w:rPr>
+                <w:rFonts w:ascii="Arial" w:hAnsi="Arial" w:cs="Arial"/>
+              </w:rPr>
+              <w:t> </w:t>
+            </w:r>
+            <w:r>
+              <w:rPr>
+                <w:rFonts w:ascii="Arial" w:hAnsi="Arial" w:cs="Arial" w:hint="eastAsia"/>
+              </w:rPr>
+              <w:t>C#</w:t>
+            </w:r>
+          </w:p>
+        </w:tc>
+        <w:tc>
+          <w:tcPr>
+            <w:tcW w:w="2697" w:type="dxa"/>
+          </w:tcPr>
+          <w:p>
+            <w:pPr>
+              <w:tabs>
+                <w:tab w:val="right" w:pos="720"/>
+                <w:tab w:val="right" w:pos="9360"/>
+                <w:tab w:val="right" w:pos="31680"/>
+              </w:tabs>
+              <w:spacing w:line="276" w:lineRule="auto"/>
+              <w:rPr>
+                <w:rFonts w:ascii="Arial" w:hAnsi="Arial" w:cs="Arial" w:hint="eastAsia"/>
+              </w:rPr>
+            </w:pPr>
+            <w:r>
+              <w:rPr>
+                <w:rFonts w:ascii="Arial" w:hAnsi="Arial" w:cs="Arial"/>
+              </w:rPr>
+              <w:t>•</w:t>
+            </w:r>
+            <w:r>
+              <w:rPr>
+                <w:rFonts w:ascii="Arial" w:hAnsi="Arial" w:cs="Arial"/>
+              </w:rPr>
+              <w:t> </w:t>
+            </w:r>
+            <w:r>
+              <w:rPr>
+                <w:rFonts w:ascii="Arial" w:hAnsi="Arial" w:cs="Arial" w:hint="eastAsia"/>
+              </w:rPr>
+              <w:t>C++</w:t>
+            </w:r>
+          </w:p>
+        </w:tc>
+        <w:tc>
+          <w:tcPr>
+            <w:tcW w:w="2698" w:type="dxa"/>
+          </w:tcPr>
+          <w:p>
+            <w:pPr>
+              <w:tabs>
+                <w:tab w:val="right" w:pos="720"/>
+                <w:tab w:val="right" w:pos="9360"/>
+                <w:tab w:val="right" w:pos="31680"/>
+              </w:tabs>
+              <w:spacing w:line="276" w:lineRule="auto"/>
+              <w:rPr>
+                <w:rFonts w:ascii="Arial" w:hAnsi="Arial" w:cs="Arial" w:hint="eastAsia"/>
+              </w:rPr>
+            </w:pPr>
+            <w:r>
+              <w:rPr>
+                <w:rFonts w:ascii="Arial" w:hAnsi="Arial" w:cs="Arial"/>
+              </w:rPr>
+              <w:t>•</w:t>
+            </w:r>
+            <w:r>
+              <w:rPr>
+                <w:rFonts w:ascii="Arial" w:hAnsi="Arial" w:cs="Arial"/>
+              </w:rPr>
+              <w:t> </w:t>
+            </w:r>
+            <w:r>
+              <w:rPr>
+                <w:rFonts w:ascii="Arial" w:hAnsi="Arial" w:cs="Arial" w:hint="eastAsia"/>
+              </w:rPr>
+              <w:t>JavaScript</w:t>
+            </w:r>
+          </w:p>
+        </w:tc>
+        <w:tc>
+          <w:tcPr>
+            <w:tcW w:w="2698" w:type="dxa"/>
+          </w:tcPr>
+          <w:p>
+            <w:pPr>
+              <w:tabs>
+                <w:tab w:val="right" w:pos="720"/>
+                <w:tab w:val="right" w:pos="9360"/>
+                <w:tab w:val="right" w:pos="31680"/>
+              </w:tabs>
+              <w:spacing w:line="276" w:lineRule="auto"/>
+              <w:rPr>
+                <w:rFonts w:ascii="Arial" w:hAnsi="Arial" w:cs="Arial" w:hint="eastAsia"/>
+              </w:rPr>
+            </w:pPr>
+            <w:r>
+              <w:rPr>
+                <w:rFonts w:ascii="Arial" w:hAnsi="Arial" w:cs="Arial"/>
+              </w:rPr>
+              <w:t>•</w:t>
+            </w:r>
+            <w:r>
+              <w:rPr>
+                <w:rFonts w:ascii="Arial" w:hAnsi="Arial" w:cs="Arial"/>
+              </w:rPr>
+              <w:t> </w:t>
+            </w:r>
+            <w:r>
+              <w:rPr>
+                <w:rFonts w:ascii="Arial" w:hAnsi="Arial" w:cs="Arial" w:hint="eastAsia"/>
+              </w:rPr>
+              <w:t>HTML</w:t>
+            </w:r>
+          </w:p>
+        </w:tc>
+      </w:tr>
+      <w:tr>
+        <w:tc>
+          <w:tcPr>
+            <w:tcW w:w="2697" w:type="dxa"/>
+          </w:tcPr>
+          <w:p>
+            <w:pPr>
+              <w:tabs>
+                <w:tab w:val="right" w:pos="720"/>
+                <w:tab w:val="right" w:pos="9360"/>
+                <w:tab w:val="right" w:pos="31680"/>
+              </w:tabs>
+              <w:spacing w:line="276" w:lineRule="auto"/>
+              <w:rPr>
+                <w:rFonts w:ascii="Arial" w:hAnsi="Arial" w:cs="Arial" w:hint="eastAsia"/>
+              </w:rPr>
+            </w:pPr>
+            <w:r>
+              <w:rPr>
+                <w:rFonts w:ascii="Arial" w:hAnsi="Arial" w:cs="Arial"/>
+              </w:rPr>
+              <w:t>•</w:t>
+            </w:r>
+            <w:r>
+              <w:rPr>
+                <w:rFonts w:ascii="Arial" w:hAnsi="Arial" w:cs="Arial"/>
+              </w:rPr>
+              <w:t> </w:t>
+            </w:r>
+            <w:r>
+              <w:rPr>
+                <w:rFonts w:ascii="Arial" w:hAnsi="Arial" w:cs="Arial" w:hint="eastAsia"/>
+              </w:rPr>
+              <w:t>Unity</w:t>
+            </w:r>
+          </w:p>
+        </w:tc>
+        <w:tc>
+          <w:tcPr>
+            <w:tcW w:w="2697" w:type="dxa"/>
+          </w:tcPr>
+          <w:p>
+            <w:pPr>
+              <w:tabs>
+                <w:tab w:val="right" w:pos="720"/>
+                <w:tab w:val="right" w:pos="9360"/>
+                <w:tab w:val="right" w:pos="31680"/>
+              </w:tabs>
+              <w:spacing w:line="276" w:lineRule="auto"/>
+              <w:rPr>
+                <w:rFonts w:ascii="Arial" w:hAnsi="Arial" w:cs="Arial" w:hint="eastAsia"/>
+              </w:rPr>
+            </w:pPr>
+            <w:r>
+              <w:rPr>
+                <w:rFonts w:ascii="Arial" w:hAnsi="Arial" w:cs="Arial"/>
+              </w:rPr>
+              <w:t>•</w:t>
+            </w:r>
+            <w:r>
+              <w:rPr>
+                <w:rFonts w:ascii="Arial" w:hAnsi="Arial" w:cs="Arial"/>
+              </w:rPr>
+              <w:t> </w:t>
+            </w:r>
+            <w:r>
+              <w:rPr>
+                <w:rFonts w:ascii="Arial" w:hAnsi="Arial" w:cs="Arial" w:hint="eastAsia"/>
+              </w:rPr>
+              <w:t>Graphics Programming</w:t>
+            </w:r>
+          </w:p>
+        </w:tc>
+        <w:tc>
+          <w:tcPr>
+            <w:tcW w:w="2698" w:type="dxa"/>
+          </w:tcPr>
+          <w:p>
+            <w:pPr>
+              <w:tabs>
+                <w:tab w:val="right" w:pos="720"/>
+                <w:tab w:val="right" w:pos="9360"/>
+                <w:tab w:val="right" w:pos="31680"/>
+              </w:tabs>
+              <w:spacing w:line="276" w:lineRule="auto"/>
+              <w:rPr>
+                <w:rFonts w:ascii="Arial" w:hAnsi="Arial" w:cs="Arial" w:hint="eastAsia"/>
+              </w:rPr>
+            </w:pPr>
+            <w:r>
+              <w:rPr>
+                <w:rFonts w:ascii="Arial" w:hAnsi="Arial" w:cs="Arial"/>
+              </w:rPr>
+              <w:t>•</w:t>
+            </w:r>
+            <w:r>
+              <w:rPr>
+                <w:rFonts w:ascii="Arial" w:hAnsi="Arial" w:cs="Arial"/>
+              </w:rPr>
+              <w:t> </w:t>
+            </w:r>
+            <w:r>
+              <w:rPr>
+                <w:rFonts w:ascii="Arial" w:hAnsi="Arial" w:cs="Arial" w:hint="eastAsia"/>
+              </w:rPr>
+              <w:t>React</w:t>
+            </w:r>
+          </w:p>
+        </w:tc>
+        <w:tc>
+          <w:tcPr>
+            <w:tcW w:w="2698" w:type="dxa"/>
+          </w:tcPr>
+          <w:p>
+            <w:pPr>
+              <w:tabs>
+                <w:tab w:val="right" w:pos="720"/>
+                <w:tab w:val="right" w:pos="9360"/>
+                <w:tab w:val="right" w:pos="31680"/>
+              </w:tabs>
+              <w:spacing w:line="276" w:lineRule="auto"/>
+              <w:rPr>
+                <w:rFonts w:ascii="Arial" w:hAnsi="Arial" w:cs="Arial" w:hint="eastAsia"/>
+              </w:rPr>
+            </w:pPr>
+            <w:r>
+              <w:rPr>
+                <w:rFonts w:ascii="Arial" w:hAnsi="Arial" w:cs="Arial"/>
+              </w:rPr>
+              <w:t>•</w:t>
+            </w:r>
+            <w:r>
+              <w:rPr>
+                <w:rFonts w:ascii="Arial" w:hAnsi="Arial" w:cs="Arial"/>
+              </w:rPr>
+              <w:t> </w:t>
+            </w:r>
+            <w:r>
+              <w:rPr>
+                <w:rFonts w:ascii="Arial" w:hAnsi="Arial" w:cs="Arial" w:hint="eastAsia"/>
+              </w:rPr>
+              <w:t>CSS</w:t>
+            </w:r>
+          </w:p>
+        </w:tc>
+      </w:tr>
+      <w:tr>
+        <w:tc>
+          <w:tcPr>
+            <w:tcW w:w="2697" w:type="dxa"/>
+          </w:tcPr>
+          <w:p>
+            <w:pPr>
+              <w:tabs>
+                <w:tab w:val="right" w:pos="720"/>
+                <w:tab w:val="right" w:pos="9360"/>
+                <w:tab w:val="right" w:pos="31680"/>
+              </w:tabs>
+              <w:spacing w:line="276" w:lineRule="auto"/>
+              <w:rPr>
+                <w:rFonts w:ascii="Arial" w:hAnsi="Arial" w:cs="Arial" w:hint="eastAsia"/>
+              </w:rPr>
+            </w:pPr>
+            <w:r>
+              <w:rPr>
+                <w:rFonts w:ascii="Arial" w:hAnsi="Arial" w:cs="Arial"/>
+              </w:rPr>
+              <w:t>•</w:t>
+            </w:r>
+            <w:r>
+              <w:rPr>
+                <w:rFonts w:ascii="Arial" w:hAnsi="Arial" w:cs="Arial"/>
+              </w:rPr>
+              <w:t> </w:t>
+            </w:r>
+            <w:r>
+              <w:rPr>
+                <w:rFonts w:ascii="Arial" w:hAnsi="Arial" w:cs="Arial" w:hint="eastAsia"/>
+              </w:rPr>
+              <w:t xml:space="preserve">Gameplay </w:t>
+            </w:r>
+          </w:p>
+        </w:tc>
+        <w:tc>
+          <w:tcPr>
+            <w:tcW w:w="2697" w:type="dxa"/>
+          </w:tcPr>
+          <w:p>
+            <w:pPr>
+              <w:tabs>
+                <w:tab w:val="right" w:pos="720"/>
+                <w:tab w:val="right" w:pos="9360"/>
+                <w:tab w:val="right" w:pos="31680"/>
+              </w:tabs>
+              <w:spacing w:line="276" w:lineRule="auto"/>
+              <w:rPr>
+                <w:rFonts w:ascii="Arial" w:hAnsi="Arial" w:cs="Arial" w:hint="eastAsia"/>
+              </w:rPr>
+            </w:pPr>
+            <w:r>
+              <w:rPr>
+                <w:rFonts w:ascii="Arial" w:hAnsi="Arial" w:cs="Arial"/>
+              </w:rPr>
+              <w:t>•</w:t>
+            </w:r>
+            <w:r>
+              <w:rPr>
+                <w:rFonts w:ascii="Arial" w:hAnsi="Arial" w:cs="Arial"/>
+              </w:rPr>
+              <w:t> </w:t>
+            </w:r>
+            <w:r>
+              <w:rPr>
+                <w:rFonts w:ascii="Arial" w:hAnsi="Arial" w:cs="Arial" w:hint="eastAsia"/>
+              </w:rPr>
+              <w:t>Direct3D 11</w:t>
+            </w:r>
+          </w:p>
+        </w:tc>
+        <w:tc>
+          <w:tcPr>
+            <w:tcW w:w="2698" w:type="dxa"/>
+          </w:tcPr>
+          <w:p>
+            <w:pPr>
+              <w:tabs>
+                <w:tab w:val="right" w:pos="720"/>
+                <w:tab w:val="right" w:pos="9360"/>
+                <w:tab w:val="right" w:pos="31680"/>
+              </w:tabs>
+              <w:spacing w:line="276" w:lineRule="auto"/>
+              <w:rPr>
+                <w:rFonts w:ascii="Arial" w:hAnsi="Arial" w:cs="Arial" w:hint="eastAsia"/>
+              </w:rPr>
+            </w:pPr>
+            <w:r>
+              <w:rPr>
+                <w:rFonts w:ascii="Arial" w:hAnsi="Arial" w:cs="Arial"/>
+              </w:rPr>
+              <w:t>•</w:t>
+            </w:r>
+            <w:r>
+              <w:rPr>
+                <w:rFonts w:ascii="Arial" w:hAnsi="Arial" w:cs="Arial"/>
+              </w:rPr>
+              <w:t> </w:t>
+            </w:r>
+            <w:r>
+              <w:rPr>
+                <w:rFonts w:ascii="Arial" w:hAnsi="Arial" w:cs="Arial" w:hint="eastAsia"/>
+              </w:rPr>
+              <w:t>Frontend</w:t>
+            </w:r>
+          </w:p>
+        </w:tc>
+        <w:tc>
+          <w:tcPr>
+            <w:tcW w:w="2698" w:type="dxa"/>
+          </w:tcPr>
+          <w:p>
+            <w:pPr>
+              <w:tabs>
+                <w:tab w:val="right" w:pos="720"/>
+                <w:tab w:val="right" w:pos="9360"/>
+                <w:tab w:val="right" w:pos="31680"/>
+              </w:tabs>
+              <w:spacing w:line="276" w:lineRule="auto"/>
+              <w:rPr>
+                <w:rFonts w:ascii="Arial" w:hAnsi="Arial" w:cs="Arial" w:hint="eastAsia"/>
+              </w:rPr>
+            </w:pPr>
+            <w:r>
+              <w:rPr>
+                <w:rFonts w:ascii="Arial" w:hAnsi="Arial" w:cs="Arial"/>
+              </w:rPr>
+              <w:t>•</w:t>
+            </w:r>
+            <w:r>
+              <w:rPr>
+                <w:rFonts w:ascii="Arial" w:hAnsi="Arial" w:cs="Arial"/>
+              </w:rPr>
+              <w:t> </w:t>
+            </w:r>
+            <w:r>
+              <w:rPr>
+                <w:rFonts w:ascii="Arial" w:hAnsi="Arial" w:cs="Arial" w:hint="eastAsia"/>
+              </w:rPr>
+              <w:t>UI / HUD</w:t>
+            </w:r>
+          </w:p>
+        </w:tc>
+      </w:tr>
+      <w:tr>
+        <w:tc>
+          <w:tcPr>
+            <w:tcW w:w="2697" w:type="dxa"/>
+          </w:tcPr>
+          <w:p>
+            <w:pPr>
+              <w:tabs>
+                <w:tab w:val="right" w:pos="720"/>
+                <w:tab w:val="right" w:pos="9360"/>
+                <w:tab w:val="right" w:pos="31680"/>
+              </w:tabs>
+              <w:spacing w:line="276" w:lineRule="auto"/>
+              <w:rPr>
+                <w:rFonts w:ascii="Arial" w:hAnsi="Arial" w:cs="Arial" w:hint="eastAsia"/>
+              </w:rPr>
+            </w:pPr>
+            <w:r>
+              <w:rPr>
+                <w:rFonts w:ascii="Arial" w:hAnsi="Arial" w:cs="Arial"/>
+              </w:rPr>
+              <w:t>•</w:t>
+            </w:r>
+            <w:r>
+              <w:rPr>
+                <w:rFonts w:ascii="Arial" w:hAnsi="Arial" w:cs="Arial"/>
+              </w:rPr>
+              <w:t> </w:t>
+            </w:r>
+            <w:r>
+              <w:rPr>
+                <w:rFonts w:ascii="Arial" w:hAnsi="Arial" w:cs="Arial" w:hint="eastAsia"/>
+              </w:rPr>
+              <w:t>AI</w:t>
+            </w:r>
+          </w:p>
+        </w:tc>
+        <w:tc>
+          <w:tcPr>
+            <w:tcW w:w="2697" w:type="dxa"/>
+          </w:tcPr>
+          <w:p>
+            <w:pPr>
+              <w:tabs>
+                <w:tab w:val="right" w:pos="720"/>
+                <w:tab w:val="right" w:pos="9360"/>
+                <w:tab w:val="right" w:pos="31680"/>
+              </w:tabs>
+              <w:spacing w:line="276" w:lineRule="auto"/>
+              <w:rPr>
+                <w:rFonts w:ascii="Arial" w:hAnsi="Arial" w:cs="Arial" w:hint="eastAsia"/>
+              </w:rPr>
+            </w:pPr>
+            <w:r>
+              <w:rPr>
+                <w:rFonts w:ascii="Arial" w:hAnsi="Arial" w:cs="Arial"/>
+              </w:rPr>
+              <w:t>•</w:t>
+            </w:r>
+            <w:r>
+              <w:rPr>
+                <w:rFonts w:ascii="Arial" w:hAnsi="Arial" w:cs="Arial"/>
+              </w:rPr>
+              <w:t> </w:t>
+            </w:r>
+            <w:r>
+              <w:rPr>
+                <w:rFonts w:ascii="Arial" w:hAnsi="Arial" w:cs="Arial" w:hint="eastAsia"/>
+              </w:rPr>
+              <w:t>Physics</w:t>
+            </w:r>
+          </w:p>
+        </w:tc>
+        <w:tc>
+          <w:tcPr>
+            <w:tcW w:w="2698" w:type="dxa"/>
+          </w:tcPr>
+          <w:p>
+            <w:pPr>
+              <w:tabs>
+                <w:tab w:val="right" w:pos="720"/>
+                <w:tab w:val="right" w:pos="9360"/>
+                <w:tab w:val="right" w:pos="31680"/>
+              </w:tabs>
+              <w:spacing w:line="276" w:lineRule="auto"/>
+              <w:rPr>
+                <w:rFonts w:ascii="Arial" w:hAnsi="Arial" w:cs="Arial" w:hint="eastAsia"/>
+              </w:rPr>
+            </w:pPr>
+            <w:r>
+              <w:rPr>
+                <w:rFonts w:ascii="Arial" w:hAnsi="Arial" w:cs="Arial"/>
+              </w:rPr>
+              <w:t>•</w:t>
+            </w:r>
+            <w:r>
+              <w:rPr>
+                <w:rFonts w:ascii="Arial" w:hAnsi="Arial" w:cs="Arial"/>
+              </w:rPr>
+              <w:t> </w:t>
+            </w:r>
+            <w:r>
+              <w:rPr>
+                <w:rFonts w:ascii="Arial" w:hAnsi="Arial" w:cs="Arial" w:hint="eastAsia"/>
+              </w:rPr>
+              <w:t>Git</w:t>
+            </w:r>
+          </w:p>
+        </w:tc>
+        <w:tc>
+          <w:tcPr>
+            <w:tcW w:w="2698" w:type="dxa"/>
+          </w:tcPr>
+          <w:p>
+            <w:pPr>
+              <w:tabs>
+                <w:tab w:val="right" w:pos="720"/>
+                <w:tab w:val="right" w:pos="9360"/>
+                <w:tab w:val="right" w:pos="31680"/>
+              </w:tabs>
+              <w:spacing w:line="276" w:lineRule="auto"/>
+              <w:rPr>
+                <w:rFonts w:ascii="Arial" w:hAnsi="Arial" w:cs="Arial" w:hint="eastAsia"/>
+              </w:rPr>
+            </w:pPr>
+            <w:r>
+              <w:rPr>
+                <w:rFonts w:ascii="Arial" w:hAnsi="Arial" w:cs="Arial"/>
+              </w:rPr>
+              <w:t>•</w:t>
+            </w:r>
+            <w:r>
+              <w:rPr>
+                <w:rFonts w:ascii="Arial" w:hAnsi="Arial" w:cs="Arial"/>
+              </w:rPr>
+              <w:t> </w:t>
+            </w:r>
+            <w:r>
+              <w:rPr>
+                <w:rFonts w:ascii="Arial" w:hAnsi="Arial" w:cs="Arial" w:hint="eastAsia"/>
+              </w:rPr>
+              <w:t>State Machines</w:t>
+            </w:r>
+          </w:p>
+        </w:tc>
+      </w:tr>
+    </w:tbl>
     <w:p>
       <w:pPr>
         <w:tabs>
@@ -1003,7 +1474,21 @@
         <w:rPr>
           <w:rFonts w:ascii="Arial" w:hAnsi="Arial" w:cs="Arial"/>
         </w:rPr>
-        <w:t>Modified existing game systems using ETGMod to integrate custom input, movement, and animation behavior.</w:t>
+        <w:t xml:space="preserve">Modified existing game systems using </w:t>
+      </w:r>
+      <w:proofErr w:type="spellStart"/>
+      <w:r>
+        <w:rPr>
+          <w:rFonts w:ascii="Arial" w:hAnsi="Arial" w:cs="Arial"/>
+        </w:rPr>
+        <w:t>ETGMod</w:t>
+      </w:r>
+      <w:proofErr w:type="spellEnd"/>
+      <w:r>
+        <w:rPr>
+          <w:rFonts w:ascii="Arial" w:hAnsi="Arial" w:cs="Arial"/>
+        </w:rPr>
+        <w:t xml:space="preserve"> to integrate custom input, movement, and animation behavior.</w:t>
       </w:r>
     </w:p>
     <w:p>
@@ -1033,13 +1518,23 @@
         </w:rPr>
         <w:t xml:space="preserve"> — </w:t>
       </w:r>
+      <w:proofErr w:type="spellStart"/>
       <w:r>
         <w:rPr>
           <w:rFonts w:ascii="Arial" w:hAnsi="Arial" w:cs="Arial" w:hint="eastAsia"/>
           <w:b/>
           <w:bCs/>
         </w:rPr>
-        <w:t>Hyperdeath Robotika</w:t>
+        <w:t>Hyperdeath</w:t>
+      </w:r>
+      <w:proofErr w:type="spellEnd"/>
+      <w:r>
+        <w:rPr>
+          <w:rFonts w:ascii="Arial" w:hAnsi="Arial" w:cs="Arial" w:hint="eastAsia"/>
+          <w:b/>
+          <w:bCs/>
+        </w:rPr>
+        <w:t xml:space="preserve"> Robotika</w:t>
       </w:r>
       <w:r>
         <w:rPr>
@@ -1267,7 +1762,21 @@
         <w:rPr>
           <w:rFonts w:ascii="Arial" w:hAnsi="Arial" w:cs="Arial"/>
         </w:rPr>
-        <w:t xml:space="preserve"> tModLoader </w:t>
+        <w:t xml:space="preserve"> </w:t>
+      </w:r>
+      <w:proofErr w:type="spellStart"/>
+      <w:r>
+        <w:rPr>
+          <w:rFonts w:ascii="Arial" w:hAnsi="Arial" w:cs="Arial"/>
+        </w:rPr>
+        <w:t>tModLoader</w:t>
+      </w:r>
+      <w:proofErr w:type="spellEnd"/>
+      <w:r>
+        <w:rPr>
+          <w:rFonts w:ascii="Arial" w:hAnsi="Arial" w:cs="Arial"/>
+        </w:rPr>
+        <w:t xml:space="preserve"> </w:t>
       </w:r>
       <w:r>
         <w:rPr>
@@ -2060,6 +2569,232 @@
       </w:rPr>
     </w:lvl>
   </w:abstractNum>
+  <w:abstractNum w:abstractNumId="4" w15:restartNumberingAfterBreak="0">
+    <w:nsid w:val="5B8F42CD"/>
+    <w:multiLevelType w:val="hybridMultilevel"/>
+    <w:tmpl w:val="E6A4C580"/>
+    <w:lvl w:ilvl="0" w:tplc="04090001">
+      <w:start w:val="1"/>
+      <w:numFmt w:val="bullet"/>
+      <w:lvlText w:val=""/>
+      <w:lvlJc w:val="left"/>
+      <w:pPr>
+        <w:ind w:left="720" w:hanging="360"/>
+      </w:pPr>
+      <w:rPr>
+        <w:rFonts w:ascii="Symbol" w:hAnsi="Symbol" w:hint="default"/>
+      </w:rPr>
+    </w:lvl>
+    <w:lvl w:ilvl="1" w:tplc="04090003" w:tentative="1">
+      <w:start w:val="1"/>
+      <w:numFmt w:val="bullet"/>
+      <w:lvlText w:val="o"/>
+      <w:lvlJc w:val="left"/>
+      <w:pPr>
+        <w:ind w:left="1440" w:hanging="360"/>
+      </w:pPr>
+      <w:rPr>
+        <w:rFonts w:ascii="Courier New" w:hAnsi="Courier New" w:cs="Courier New" w:hint="default"/>
+      </w:rPr>
+    </w:lvl>
+    <w:lvl w:ilvl="2" w:tplc="04090005" w:tentative="1">
+      <w:start w:val="1"/>
+      <w:numFmt w:val="bullet"/>
+      <w:lvlText w:val=""/>
+      <w:lvlJc w:val="left"/>
+      <w:pPr>
+        <w:ind w:left="2160" w:hanging="360"/>
+      </w:pPr>
+      <w:rPr>
+        <w:rFonts w:ascii="Wingdings" w:hAnsi="Wingdings" w:hint="default"/>
+      </w:rPr>
+    </w:lvl>
+    <w:lvl w:ilvl="3" w:tplc="04090001" w:tentative="1">
+      <w:start w:val="1"/>
+      <w:numFmt w:val="bullet"/>
+      <w:lvlText w:val=""/>
+      <w:lvlJc w:val="left"/>
+      <w:pPr>
+        <w:ind w:left="2880" w:hanging="360"/>
+      </w:pPr>
+      <w:rPr>
+        <w:rFonts w:ascii="Symbol" w:hAnsi="Symbol" w:hint="default"/>
+      </w:rPr>
+    </w:lvl>
+    <w:lvl w:ilvl="4" w:tplc="04090003" w:tentative="1">
+      <w:start w:val="1"/>
+      <w:numFmt w:val="bullet"/>
+      <w:lvlText w:val="o"/>
+      <w:lvlJc w:val="left"/>
+      <w:pPr>
+        <w:ind w:left="3600" w:hanging="360"/>
+      </w:pPr>
+      <w:rPr>
+        <w:rFonts w:ascii="Courier New" w:hAnsi="Courier New" w:cs="Courier New" w:hint="default"/>
+      </w:rPr>
+    </w:lvl>
+    <w:lvl w:ilvl="5" w:tplc="04090005" w:tentative="1">
+      <w:start w:val="1"/>
+      <w:numFmt w:val="bullet"/>
+      <w:lvlText w:val=""/>
+      <w:lvlJc w:val="left"/>
+      <w:pPr>
+        <w:ind w:left="4320" w:hanging="360"/>
+      </w:pPr>
+      <w:rPr>
+        <w:rFonts w:ascii="Wingdings" w:hAnsi="Wingdings" w:hint="default"/>
+      </w:rPr>
+    </w:lvl>
+    <w:lvl w:ilvl="6" w:tplc="04090001" w:tentative="1">
+      <w:start w:val="1"/>
+      <w:numFmt w:val="bullet"/>
+      <w:lvlText w:val=""/>
+      <w:lvlJc w:val="left"/>
+      <w:pPr>
+        <w:ind w:left="5040" w:hanging="360"/>
+      </w:pPr>
+      <w:rPr>
+        <w:rFonts w:ascii="Symbol" w:hAnsi="Symbol" w:hint="default"/>
+      </w:rPr>
+    </w:lvl>
+    <w:lvl w:ilvl="7" w:tplc="04090003" w:tentative="1">
+      <w:start w:val="1"/>
+      <w:numFmt w:val="bullet"/>
+      <w:lvlText w:val="o"/>
+      <w:lvlJc w:val="left"/>
+      <w:pPr>
+        <w:ind w:left="5760" w:hanging="360"/>
+      </w:pPr>
+      <w:rPr>
+        <w:rFonts w:ascii="Courier New" w:hAnsi="Courier New" w:cs="Courier New" w:hint="default"/>
+      </w:rPr>
+    </w:lvl>
+    <w:lvl w:ilvl="8" w:tplc="04090005" w:tentative="1">
+      <w:start w:val="1"/>
+      <w:numFmt w:val="bullet"/>
+      <w:lvlText w:val=""/>
+      <w:lvlJc w:val="left"/>
+      <w:pPr>
+        <w:ind w:left="6480" w:hanging="360"/>
+      </w:pPr>
+      <w:rPr>
+        <w:rFonts w:ascii="Wingdings" w:hAnsi="Wingdings" w:hint="default"/>
+      </w:rPr>
+    </w:lvl>
+  </w:abstractNum>
+  <w:abstractNum w:abstractNumId="5" w15:restartNumberingAfterBreak="0">
+    <w:nsid w:val="78D30CB5"/>
+    <w:multiLevelType w:val="hybridMultilevel"/>
+    <w:tmpl w:val="4914F0E0"/>
+    <w:lvl w:ilvl="0" w:tplc="04090001">
+      <w:start w:val="1"/>
+      <w:numFmt w:val="bullet"/>
+      <w:lvlText w:val=""/>
+      <w:lvlJc w:val="left"/>
+      <w:pPr>
+        <w:ind w:left="720" w:hanging="360"/>
+      </w:pPr>
+      <w:rPr>
+        <w:rFonts w:ascii="Symbol" w:hAnsi="Symbol" w:hint="default"/>
+      </w:rPr>
+    </w:lvl>
+    <w:lvl w:ilvl="1" w:tplc="04090003" w:tentative="1">
+      <w:start w:val="1"/>
+      <w:numFmt w:val="bullet"/>
+      <w:lvlText w:val="o"/>
+      <w:lvlJc w:val="left"/>
+      <w:pPr>
+        <w:ind w:left="1440" w:hanging="360"/>
+      </w:pPr>
+      <w:rPr>
+        <w:rFonts w:ascii="Courier New" w:hAnsi="Courier New" w:cs="Courier New" w:hint="default"/>
+      </w:rPr>
+    </w:lvl>
+    <w:lvl w:ilvl="2" w:tplc="04090005" w:tentative="1">
+      <w:start w:val="1"/>
+      <w:numFmt w:val="bullet"/>
+      <w:lvlText w:val=""/>
+      <w:lvlJc w:val="left"/>
+      <w:pPr>
+        <w:ind w:left="2160" w:hanging="360"/>
+      </w:pPr>
+      <w:rPr>
+        <w:rFonts w:ascii="Wingdings" w:hAnsi="Wingdings" w:hint="default"/>
+      </w:rPr>
+    </w:lvl>
+    <w:lvl w:ilvl="3" w:tplc="04090001" w:tentative="1">
+      <w:start w:val="1"/>
+      <w:numFmt w:val="bullet"/>
+      <w:lvlText w:val=""/>
+      <w:lvlJc w:val="left"/>
+      <w:pPr>
+        <w:ind w:left="2880" w:hanging="360"/>
+      </w:pPr>
+      <w:rPr>
+        <w:rFonts w:ascii="Symbol" w:hAnsi="Symbol" w:hint="default"/>
+      </w:rPr>
+    </w:lvl>
+    <w:lvl w:ilvl="4" w:tplc="04090003" w:tentative="1">
+      <w:start w:val="1"/>
+      <w:numFmt w:val="bullet"/>
+      <w:lvlText w:val="o"/>
+      <w:lvlJc w:val="left"/>
+      <w:pPr>
+        <w:ind w:left="3600" w:hanging="360"/>
+      </w:pPr>
+      <w:rPr>
+        <w:rFonts w:ascii="Courier New" w:hAnsi="Courier New" w:cs="Courier New" w:hint="default"/>
+      </w:rPr>
+    </w:lvl>
+    <w:lvl w:ilvl="5" w:tplc="04090005" w:tentative="1">
+      <w:start w:val="1"/>
+      <w:numFmt w:val="bullet"/>
+      <w:lvlText w:val=""/>
+      <w:lvlJc w:val="left"/>
+      <w:pPr>
+        <w:ind w:left="4320" w:hanging="360"/>
+      </w:pPr>
+      <w:rPr>
+        <w:rFonts w:ascii="Wingdings" w:hAnsi="Wingdings" w:hint="default"/>
+      </w:rPr>
+    </w:lvl>
+    <w:lvl w:ilvl="6" w:tplc="04090001" w:tentative="1">
+      <w:start w:val="1"/>
+      <w:numFmt w:val="bullet"/>
+      <w:lvlText w:val=""/>
+      <w:lvlJc w:val="left"/>
+      <w:pPr>
+        <w:ind w:left="5040" w:hanging="360"/>
+      </w:pPr>
+      <w:rPr>
+        <w:rFonts w:ascii="Symbol" w:hAnsi="Symbol" w:hint="default"/>
+      </w:rPr>
+    </w:lvl>
+    <w:lvl w:ilvl="7" w:tplc="04090003" w:tentative="1">
+      <w:start w:val="1"/>
+      <w:numFmt w:val="bullet"/>
+      <w:lvlText w:val="o"/>
+      <w:lvlJc w:val="left"/>
+      <w:pPr>
+        <w:ind w:left="5760" w:hanging="360"/>
+      </w:pPr>
+      <w:rPr>
+        <w:rFonts w:ascii="Courier New" w:hAnsi="Courier New" w:cs="Courier New" w:hint="default"/>
+      </w:rPr>
+    </w:lvl>
+    <w:lvl w:ilvl="8" w:tplc="04090005" w:tentative="1">
+      <w:start w:val="1"/>
+      <w:numFmt w:val="bullet"/>
+      <w:lvlText w:val=""/>
+      <w:lvlJc w:val="left"/>
+      <w:pPr>
+        <w:ind w:left="6480" w:hanging="360"/>
+      </w:pPr>
+      <w:rPr>
+        <w:rFonts w:ascii="Wingdings" w:hAnsi="Wingdings" w:hint="default"/>
+      </w:rPr>
+    </w:lvl>
+  </w:abstractNum>
   <w:num w:numId="1" w16cid:durableId="1508397987">
     <w:abstractNumId w:val="2"/>
   </w:num>
@@ -2071,6 +2806,12 @@
   </w:num>
   <w:num w:numId="4" w16cid:durableId="1444761673">
     <w:abstractNumId w:val="0"/>
+  </w:num>
+  <w:num w:numId="5" w16cid:durableId="1637829879">
+    <w:abstractNumId w:val="4"/>
+  </w:num>
+  <w:num w:numId="6" w16cid:durableId="1155295772">
+    <w:abstractNumId w:val="5"/>
   </w:num>
 </w:numbering>
 </file>
@@ -2479,7 +3220,6 @@
   <w:style w:type="character" w:default="1" w:styleId="DefaultParagraphFont">
     <w:name w:val="Default Paragraph Font"/>
     <w:uiPriority w:val="1"/>
-    <w:semiHidden/>
     <w:unhideWhenUsed/>
   </w:style>
   <w:style w:type="table" w:default="1" w:styleId="TableNormal">
@@ -2548,6 +3288,25 @@
       <w:color w:val="954F72" w:themeColor="followedHyperlink"/>
       <w:u w:val="single"/>
     </w:rPr>
+  </w:style>
+  <w:style w:type="table" w:styleId="TableGrid">
+    <w:name w:val="Table Grid"/>
+    <w:basedOn w:val="TableNormal"/>
+    <w:uiPriority w:val="39"/>
+    <w:rsid w:val="00500949"/>
+    <w:pPr>
+      <w:spacing w:after="0" w:line="240" w:lineRule="auto"/>
+    </w:pPr>
+    <w:tblPr>
+      <w:tblBorders>
+        <w:top w:val="single" w:sz="4" w:space="0" w:color="auto"/>
+        <w:left w:val="single" w:sz="4" w:space="0" w:color="auto"/>
+        <w:bottom w:val="single" w:sz="4" w:space="0" w:color="auto"/>
+        <w:right w:val="single" w:sz="4" w:space="0" w:color="auto"/>
+        <w:insideH w:val="single" w:sz="4" w:space="0" w:color="auto"/>
+        <w:insideV w:val="single" w:sz="4" w:space="0" w:color="auto"/>
+      </w:tblBorders>
+    </w:tblPr>
   </w:style>
 </w:styles>
 </file>

</xml_diff>

<commit_message>
Update LinkedIn links across portfolio and resume
</commit_message>
<xml_diff>
--- a/src/assets/resumes/Hyunwoo_Park_Resume.docx
+++ b/src/assets/resumes/Hyunwoo_Park_Resume.docx
@@ -140,17 +140,22 @@
             <w:rStyle w:val="Hyperlink"/>
             <w:rFonts w:ascii="Arial" w:hAnsi="Arial" w:cs="Arial"/>
           </w:rPr>
-          <w:t>-park-</w:t>
+          <w:t>-par</w:t>
         </w:r>
-        <w:proofErr w:type="spellStart"/>
         <w:r>
           <w:rPr>
             <w:rStyle w:val="Hyperlink"/>
             <w:rFonts w:ascii="Arial" w:hAnsi="Arial" w:cs="Arial"/>
           </w:rPr>
-          <w:t>rit</w:t>
+          <w:t>k</w:t>
         </w:r>
-        <w:proofErr w:type="spellEnd"/>
+        <w:r>
+          <w:rPr>
+            <w:rStyle w:val="Hyperlink"/>
+            <w:rFonts w:ascii="Arial" w:hAnsi="Arial" w:cs="Arial" w:hint="eastAsia"/>
+          </w:rPr>
+          <w:t>-dev</w:t>
+        </w:r>
         <w:r>
           <w:rPr>
             <w:rStyle w:val="Hyperlink"/>
@@ -713,7 +718,7 @@
               </w:tabs>
               <w:spacing w:line="276" w:lineRule="auto"/>
               <w:rPr>
-                <w:rFonts w:ascii="Arial" w:hAnsi="Arial" w:cs="Arial" w:hint="eastAsia"/>
+                <w:rFonts w:ascii="Arial" w:hAnsi="Arial" w:cs="Arial"/>
               </w:rPr>
             </w:pPr>
             <w:r>
@@ -749,7 +754,7 @@
               </w:tabs>
               <w:spacing w:line="276" w:lineRule="auto"/>
               <w:rPr>
-                <w:rFonts w:ascii="Arial" w:hAnsi="Arial" w:cs="Arial" w:hint="eastAsia"/>
+                <w:rFonts w:ascii="Arial" w:hAnsi="Arial" w:cs="Arial"/>
               </w:rPr>
             </w:pPr>
             <w:r>
@@ -785,7 +790,7 @@
               </w:tabs>
               <w:spacing w:line="276" w:lineRule="auto"/>
               <w:rPr>
-                <w:rFonts w:ascii="Arial" w:hAnsi="Arial" w:cs="Arial" w:hint="eastAsia"/>
+                <w:rFonts w:ascii="Arial" w:hAnsi="Arial" w:cs="Arial"/>
               </w:rPr>
             </w:pPr>
             <w:r>
@@ -821,7 +826,7 @@
               </w:tabs>
               <w:spacing w:line="276" w:lineRule="auto"/>
               <w:rPr>
-                <w:rFonts w:ascii="Arial" w:hAnsi="Arial" w:cs="Arial" w:hint="eastAsia"/>
+                <w:rFonts w:ascii="Arial" w:hAnsi="Arial" w:cs="Arial"/>
               </w:rPr>
             </w:pPr>
             <w:r>
@@ -859,7 +864,7 @@
               </w:tabs>
               <w:spacing w:line="276" w:lineRule="auto"/>
               <w:rPr>
-                <w:rFonts w:ascii="Arial" w:hAnsi="Arial" w:cs="Arial" w:hint="eastAsia"/>
+                <w:rFonts w:ascii="Arial" w:hAnsi="Arial" w:cs="Arial"/>
               </w:rPr>
             </w:pPr>
             <w:r>
@@ -895,7 +900,7 @@
               </w:tabs>
               <w:spacing w:line="276" w:lineRule="auto"/>
               <w:rPr>
-                <w:rFonts w:ascii="Arial" w:hAnsi="Arial" w:cs="Arial" w:hint="eastAsia"/>
+                <w:rFonts w:ascii="Arial" w:hAnsi="Arial" w:cs="Arial"/>
               </w:rPr>
             </w:pPr>
             <w:r>
@@ -931,7 +936,7 @@
               </w:tabs>
               <w:spacing w:line="276" w:lineRule="auto"/>
               <w:rPr>
-                <w:rFonts w:ascii="Arial" w:hAnsi="Arial" w:cs="Arial" w:hint="eastAsia"/>
+                <w:rFonts w:ascii="Arial" w:hAnsi="Arial" w:cs="Arial"/>
               </w:rPr>
             </w:pPr>
             <w:r>
@@ -967,7 +972,7 @@
               </w:tabs>
               <w:spacing w:line="276" w:lineRule="auto"/>
               <w:rPr>
-                <w:rFonts w:ascii="Arial" w:hAnsi="Arial" w:cs="Arial" w:hint="eastAsia"/>
+                <w:rFonts w:ascii="Arial" w:hAnsi="Arial" w:cs="Arial"/>
               </w:rPr>
             </w:pPr>
             <w:r>
@@ -1005,7 +1010,7 @@
               </w:tabs>
               <w:spacing w:line="276" w:lineRule="auto"/>
               <w:rPr>
-                <w:rFonts w:ascii="Arial" w:hAnsi="Arial" w:cs="Arial" w:hint="eastAsia"/>
+                <w:rFonts w:ascii="Arial" w:hAnsi="Arial" w:cs="Arial"/>
               </w:rPr>
             </w:pPr>
             <w:r>
@@ -1041,7 +1046,7 @@
               </w:tabs>
               <w:spacing w:line="276" w:lineRule="auto"/>
               <w:rPr>
-                <w:rFonts w:ascii="Arial" w:hAnsi="Arial" w:cs="Arial" w:hint="eastAsia"/>
+                <w:rFonts w:ascii="Arial" w:hAnsi="Arial" w:cs="Arial"/>
               </w:rPr>
             </w:pPr>
             <w:r>
@@ -1077,7 +1082,7 @@
               </w:tabs>
               <w:spacing w:line="276" w:lineRule="auto"/>
               <w:rPr>
-                <w:rFonts w:ascii="Arial" w:hAnsi="Arial" w:cs="Arial" w:hint="eastAsia"/>
+                <w:rFonts w:ascii="Arial" w:hAnsi="Arial" w:cs="Arial"/>
               </w:rPr>
             </w:pPr>
             <w:r>
@@ -1113,7 +1118,7 @@
               </w:tabs>
               <w:spacing w:line="276" w:lineRule="auto"/>
               <w:rPr>
-                <w:rFonts w:ascii="Arial" w:hAnsi="Arial" w:cs="Arial" w:hint="eastAsia"/>
+                <w:rFonts w:ascii="Arial" w:hAnsi="Arial" w:cs="Arial"/>
               </w:rPr>
             </w:pPr>
             <w:r>
@@ -1151,7 +1156,7 @@
               </w:tabs>
               <w:spacing w:line="276" w:lineRule="auto"/>
               <w:rPr>
-                <w:rFonts w:ascii="Arial" w:hAnsi="Arial" w:cs="Arial" w:hint="eastAsia"/>
+                <w:rFonts w:ascii="Arial" w:hAnsi="Arial" w:cs="Arial"/>
               </w:rPr>
             </w:pPr>
             <w:r>
@@ -1187,7 +1192,7 @@
               </w:tabs>
               <w:spacing w:line="276" w:lineRule="auto"/>
               <w:rPr>
-                <w:rFonts w:ascii="Arial" w:hAnsi="Arial" w:cs="Arial" w:hint="eastAsia"/>
+                <w:rFonts w:ascii="Arial" w:hAnsi="Arial" w:cs="Arial"/>
               </w:rPr>
             </w:pPr>
             <w:r>
@@ -1223,7 +1228,7 @@
               </w:tabs>
               <w:spacing w:line="276" w:lineRule="auto"/>
               <w:rPr>
-                <w:rFonts w:ascii="Arial" w:hAnsi="Arial" w:cs="Arial" w:hint="eastAsia"/>
+                <w:rFonts w:ascii="Arial" w:hAnsi="Arial" w:cs="Arial"/>
               </w:rPr>
             </w:pPr>
             <w:r>
@@ -1259,7 +1264,7 @@
               </w:tabs>
               <w:spacing w:line="276" w:lineRule="auto"/>
               <w:rPr>
-                <w:rFonts w:ascii="Arial" w:hAnsi="Arial" w:cs="Arial" w:hint="eastAsia"/>
+                <w:rFonts w:ascii="Arial" w:hAnsi="Arial" w:cs="Arial"/>
               </w:rPr>
             </w:pPr>
             <w:r>
@@ -3220,6 +3225,7 @@
   <w:style w:type="character" w:default="1" w:styleId="DefaultParagraphFont">
     <w:name w:val="Default Paragraph Font"/>
     <w:uiPriority w:val="1"/>
+    <w:semiHidden/>
     <w:unhideWhenUsed/>
   </w:style>
   <w:style w:type="table" w:default="1" w:styleId="TableNormal">

</xml_diff>

<commit_message>
Hide phone number from portfolio
</commit_message>
<xml_diff>
--- a/src/assets/resumes/Hyunwoo_Park_Resume.docx
+++ b/src/assets/resumes/Hyunwoo_Park_Resume.docx
@@ -73,7 +73,37 @@
         <w:rPr>
           <w:rFonts w:ascii="Arial" w:hAnsi="Arial" w:cs="Arial"/>
         </w:rPr>
-        <w:t>(929) 988-2653</w:t>
+        <w:t>(</w:t>
+      </w:r>
+      <w:r>
+        <w:rPr>
+          <w:rFonts w:ascii="Arial" w:hAnsi="Arial" w:cs="Arial" w:hint="eastAsia"/>
+        </w:rPr>
+        <w:t>XXX</w:t>
+      </w:r>
+      <w:r>
+        <w:rPr>
+          <w:rFonts w:ascii="Arial" w:hAnsi="Arial" w:cs="Arial"/>
+        </w:rPr>
+        <w:t xml:space="preserve">) </w:t>
+      </w:r>
+      <w:r>
+        <w:rPr>
+          <w:rFonts w:ascii="Arial" w:hAnsi="Arial" w:cs="Arial" w:hint="eastAsia"/>
+        </w:rPr>
+        <w:t>XXX</w:t>
+      </w:r>
+      <w:r>
+        <w:rPr>
+          <w:rFonts w:ascii="Arial" w:hAnsi="Arial" w:cs="Arial"/>
+        </w:rPr>
+        <w:t>-</w:t>
+      </w:r>
+      <w:r>
+        <w:rPr>
+          <w:rFonts w:ascii="Arial" w:hAnsi="Arial" w:cs="Arial" w:hint="eastAsia"/>
+        </w:rPr>
+        <w:t>XXXX</w:t>
       </w:r>
       <w:r>
         <w:rPr>
@@ -140,14 +170,7 @@
             <w:rStyle w:val="Hyperlink"/>
             <w:rFonts w:ascii="Arial" w:hAnsi="Arial" w:cs="Arial"/>
           </w:rPr>
-          <w:t>-par</w:t>
-        </w:r>
-        <w:r>
-          <w:rPr>
-            <w:rStyle w:val="Hyperlink"/>
-            <w:rFonts w:ascii="Arial" w:hAnsi="Arial" w:cs="Arial"/>
-          </w:rPr>
-          <w:t>k</w:t>
+          <w:t>-park</w:t>
         </w:r>
         <w:r>
           <w:rPr>

</xml_diff>

<commit_message>
Update home and resume preview details
</commit_message>
<xml_diff>
--- a/src/assets/resumes/Hyunwoo_Park_Resume.docx
+++ b/src/assets/resumes/Hyunwoo_Park_Resume.docx
@@ -293,9 +293,9 @@
       </w:r>
       <w:r>
         <w:rPr>
-          <w:rFonts w:ascii="Arial" w:hAnsi="Arial" w:cs="Arial"/>
-        </w:rPr>
-        <w:t>cooperative education</w:t>
+          <w:rFonts w:ascii="Arial" w:hAnsi="Arial" w:cs="Arial" w:hint="eastAsia"/>
+        </w:rPr>
+        <w:t>full-time co-op or internship</w:t>
       </w:r>
       <w:r>
         <w:rPr>
@@ -307,43 +307,19 @@
         <w:rPr>
           <w:rFonts w:ascii="Arial" w:hAnsi="Arial" w:cs="Arial" w:hint="eastAsia"/>
         </w:rPr>
-        <w:t xml:space="preserve">position in game or software development </w:t>
-      </w:r>
-      <w:r>
-        <w:rPr>
-          <w:rFonts w:ascii="Arial" w:hAnsi="Arial" w:cs="Arial"/>
-        </w:rPr>
-        <w:t>with</w:t>
-      </w:r>
-      <w:r>
-        <w:rPr>
-          <w:rFonts w:ascii="Arial" w:hAnsi="Arial" w:cs="Arial"/>
-        </w:rPr>
-        <w:t xml:space="preserve"> </w:t>
-      </w:r>
-      <w:r>
-        <w:rPr>
-          <w:rFonts w:ascii="Arial" w:hAnsi="Arial" w:cs="Arial" w:hint="eastAsia"/>
-        </w:rPr>
-        <w:t>experience in C#</w:t>
-      </w:r>
-      <w:r>
-        <w:rPr>
-          <w:rFonts w:ascii="Arial" w:hAnsi="Arial" w:cs="Arial" w:hint="eastAsia"/>
-        </w:rPr>
-        <w:t>, Unity,</w:t>
-      </w:r>
-      <w:r>
-        <w:rPr>
-          <w:rFonts w:ascii="Arial" w:hAnsi="Arial" w:cs="Arial" w:hint="eastAsia"/>
-        </w:rPr>
-        <w:t xml:space="preserve"> and </w:t>
-      </w:r>
-      <w:r>
-        <w:rPr>
-          <w:rFonts w:ascii="Arial" w:hAnsi="Arial" w:cs="Arial" w:hint="eastAsia"/>
-        </w:rPr>
-        <w:t>object-oriented programming</w:t>
+        <w:t xml:space="preserve">in game or software development </w:t>
+      </w:r>
+      <w:r>
+        <w:rPr>
+          <w:rFonts w:ascii="Arial" w:hAnsi="Arial" w:cs="Arial"/>
+        </w:rPr>
+        <w:t xml:space="preserve">with </w:t>
+      </w:r>
+      <w:r>
+        <w:rPr>
+          <w:rFonts w:ascii="Arial" w:hAnsi="Arial" w:cs="Arial" w:hint="eastAsia"/>
+        </w:rPr>
+        <w:t>experience in C#, Unity, and object-oriented programming</w:t>
       </w:r>
       <w:r>
         <w:rPr>
@@ -507,21 +483,7 @@
         <w:rPr>
           <w:rFonts w:ascii="Arial" w:hAnsi="Arial" w:cs="Arial" w:hint="eastAsia"/>
         </w:rPr>
-        <w:t xml:space="preserve">, Fall 2023, </w:t>
-      </w:r>
-      <w:proofErr w:type="gramStart"/>
-      <w:r>
-        <w:rPr>
-          <w:rFonts w:ascii="Arial" w:hAnsi="Arial" w:cs="Arial" w:hint="eastAsia"/>
-        </w:rPr>
-        <w:t>Spring</w:t>
-      </w:r>
-      <w:proofErr w:type="gramEnd"/>
-      <w:r>
-        <w:rPr>
-          <w:rFonts w:ascii="Arial" w:hAnsi="Arial" w:cs="Arial" w:hint="eastAsia"/>
-        </w:rPr>
-        <w:t xml:space="preserve"> 2024, Fall 2024, Fall 2025</w:t>
+        <w:t>, Fall 2023, Spring 2024, Fall 2024, Fall 2025</w:t>
       </w:r>
     </w:p>
     <w:p>
@@ -707,611 +669,138 @@
         <w:t>SKILLS</w:t>
       </w:r>
     </w:p>
-    <w:tbl>
-      <w:tblPr>
-        <w:tblStyle w:val="TableGrid"/>
-        <w:tblW w:w="0" w:type="auto"/>
-        <w:tblBorders>
-          <w:top w:val="none" w:sz="0" w:space="0" w:color="auto"/>
-          <w:left w:val="none" w:sz="0" w:space="0" w:color="auto"/>
-          <w:bottom w:val="none" w:sz="0" w:space="0" w:color="auto"/>
-          <w:right w:val="none" w:sz="0" w:space="0" w:color="auto"/>
-          <w:insideH w:val="none" w:sz="0" w:space="0" w:color="auto"/>
-          <w:insideV w:val="none" w:sz="0" w:space="0" w:color="auto"/>
-        </w:tblBorders>
-        <w:tblLook w:val="04A0" w:firstRow="1" w:lastRow="0" w:firstColumn="1" w:lastColumn="0" w:noHBand="0" w:noVBand="1"/>
-      </w:tblPr>
-      <w:tblGrid>
-        <w:gridCol w:w="2697"/>
-        <w:gridCol w:w="2697"/>
-        <w:gridCol w:w="2698"/>
-        <w:gridCol w:w="2698"/>
-      </w:tblGrid>
-      <w:tr>
-        <w:tc>
-          <w:tcPr>
-            <w:tcW w:w="2697" w:type="dxa"/>
-          </w:tcPr>
-          <w:p>
-            <w:pPr>
-              <w:tabs>
-                <w:tab w:val="right" w:pos="720"/>
-                <w:tab w:val="right" w:pos="9360"/>
-                <w:tab w:val="right" w:pos="31680"/>
-              </w:tabs>
-              <w:spacing w:line="276" w:lineRule="auto"/>
-              <w:rPr>
-                <w:rFonts w:ascii="Arial" w:hAnsi="Arial" w:cs="Arial"/>
-              </w:rPr>
-            </w:pPr>
-            <w:r>
-              <w:rPr>
-                <w:rFonts w:ascii="Arial" w:hAnsi="Arial" w:cs="Arial"/>
-              </w:rPr>
-              <w:t>•</w:t>
-            </w:r>
-            <w:r>
-              <w:rPr>
-                <w:rFonts w:ascii="Arial" w:hAnsi="Arial" w:cs="Arial"/>
-              </w:rPr>
-              <w:t> </w:t>
-            </w:r>
-            <w:r>
-              <w:rPr>
-                <w:rFonts w:ascii="Arial" w:hAnsi="Arial" w:cs="Arial" w:hint="eastAsia"/>
-              </w:rPr>
-              <w:t>C#</w:t>
-            </w:r>
-          </w:p>
-        </w:tc>
-        <w:tc>
-          <w:tcPr>
-            <w:tcW w:w="2697" w:type="dxa"/>
-          </w:tcPr>
-          <w:p>
-            <w:pPr>
-              <w:tabs>
-                <w:tab w:val="right" w:pos="720"/>
-                <w:tab w:val="right" w:pos="9360"/>
-                <w:tab w:val="right" w:pos="31680"/>
-              </w:tabs>
-              <w:spacing w:line="276" w:lineRule="auto"/>
-              <w:rPr>
-                <w:rFonts w:ascii="Arial" w:hAnsi="Arial" w:cs="Arial"/>
-              </w:rPr>
-            </w:pPr>
-            <w:r>
-              <w:rPr>
-                <w:rFonts w:ascii="Arial" w:hAnsi="Arial" w:cs="Arial"/>
-              </w:rPr>
-              <w:t>•</w:t>
-            </w:r>
-            <w:r>
-              <w:rPr>
-                <w:rFonts w:ascii="Arial" w:hAnsi="Arial" w:cs="Arial"/>
-              </w:rPr>
-              <w:t> </w:t>
-            </w:r>
-            <w:r>
-              <w:rPr>
-                <w:rFonts w:ascii="Arial" w:hAnsi="Arial" w:cs="Arial" w:hint="eastAsia"/>
-              </w:rPr>
-              <w:t>C++</w:t>
-            </w:r>
-          </w:p>
-        </w:tc>
-        <w:tc>
-          <w:tcPr>
-            <w:tcW w:w="2698" w:type="dxa"/>
-          </w:tcPr>
-          <w:p>
-            <w:pPr>
-              <w:tabs>
-                <w:tab w:val="right" w:pos="720"/>
-                <w:tab w:val="right" w:pos="9360"/>
-                <w:tab w:val="right" w:pos="31680"/>
-              </w:tabs>
-              <w:spacing w:line="276" w:lineRule="auto"/>
-              <w:rPr>
-                <w:rFonts w:ascii="Arial" w:hAnsi="Arial" w:cs="Arial"/>
-              </w:rPr>
-            </w:pPr>
-            <w:r>
-              <w:rPr>
-                <w:rFonts w:ascii="Arial" w:hAnsi="Arial" w:cs="Arial"/>
-              </w:rPr>
-              <w:t>•</w:t>
-            </w:r>
-            <w:r>
-              <w:rPr>
-                <w:rFonts w:ascii="Arial" w:hAnsi="Arial" w:cs="Arial"/>
-              </w:rPr>
-              <w:t> </w:t>
-            </w:r>
-            <w:r>
-              <w:rPr>
-                <w:rFonts w:ascii="Arial" w:hAnsi="Arial" w:cs="Arial" w:hint="eastAsia"/>
-              </w:rPr>
-              <w:t>JavaScript</w:t>
-            </w:r>
-          </w:p>
-        </w:tc>
-        <w:tc>
-          <w:tcPr>
-            <w:tcW w:w="2698" w:type="dxa"/>
-          </w:tcPr>
-          <w:p>
-            <w:pPr>
-              <w:tabs>
-                <w:tab w:val="right" w:pos="720"/>
-                <w:tab w:val="right" w:pos="9360"/>
-                <w:tab w:val="right" w:pos="31680"/>
-              </w:tabs>
-              <w:spacing w:line="276" w:lineRule="auto"/>
-              <w:rPr>
-                <w:rFonts w:ascii="Arial" w:hAnsi="Arial" w:cs="Arial"/>
-              </w:rPr>
-            </w:pPr>
-            <w:r>
-              <w:rPr>
-                <w:rFonts w:ascii="Arial" w:hAnsi="Arial" w:cs="Arial"/>
-              </w:rPr>
-              <w:t>•</w:t>
-            </w:r>
-            <w:r>
-              <w:rPr>
-                <w:rFonts w:ascii="Arial" w:hAnsi="Arial" w:cs="Arial"/>
-              </w:rPr>
-              <w:t> </w:t>
-            </w:r>
-            <w:r>
-              <w:rPr>
-                <w:rFonts w:ascii="Arial" w:hAnsi="Arial" w:cs="Arial" w:hint="eastAsia"/>
-              </w:rPr>
-              <w:t>HTML</w:t>
-            </w:r>
-          </w:p>
-        </w:tc>
-      </w:tr>
-      <w:tr>
-        <w:tc>
-          <w:tcPr>
-            <w:tcW w:w="2697" w:type="dxa"/>
-          </w:tcPr>
-          <w:p>
-            <w:pPr>
-              <w:tabs>
-                <w:tab w:val="right" w:pos="720"/>
-                <w:tab w:val="right" w:pos="9360"/>
-                <w:tab w:val="right" w:pos="31680"/>
-              </w:tabs>
-              <w:spacing w:line="276" w:lineRule="auto"/>
-              <w:rPr>
-                <w:rFonts w:ascii="Arial" w:hAnsi="Arial" w:cs="Arial"/>
-              </w:rPr>
-            </w:pPr>
-            <w:r>
-              <w:rPr>
-                <w:rFonts w:ascii="Arial" w:hAnsi="Arial" w:cs="Arial"/>
-              </w:rPr>
-              <w:t>•</w:t>
-            </w:r>
-            <w:r>
-              <w:rPr>
-                <w:rFonts w:ascii="Arial" w:hAnsi="Arial" w:cs="Arial"/>
-              </w:rPr>
-              <w:t> </w:t>
-            </w:r>
-            <w:r>
-              <w:rPr>
-                <w:rFonts w:ascii="Arial" w:hAnsi="Arial" w:cs="Arial" w:hint="eastAsia"/>
-              </w:rPr>
-              <w:t>Unity</w:t>
-            </w:r>
-          </w:p>
-        </w:tc>
-        <w:tc>
-          <w:tcPr>
-            <w:tcW w:w="2697" w:type="dxa"/>
-          </w:tcPr>
-          <w:p>
-            <w:pPr>
-              <w:tabs>
-                <w:tab w:val="right" w:pos="720"/>
-                <w:tab w:val="right" w:pos="9360"/>
-                <w:tab w:val="right" w:pos="31680"/>
-              </w:tabs>
-              <w:spacing w:line="276" w:lineRule="auto"/>
-              <w:rPr>
-                <w:rFonts w:ascii="Arial" w:hAnsi="Arial" w:cs="Arial"/>
-              </w:rPr>
-            </w:pPr>
-            <w:r>
-              <w:rPr>
-                <w:rFonts w:ascii="Arial" w:hAnsi="Arial" w:cs="Arial"/>
-              </w:rPr>
-              <w:t>•</w:t>
-            </w:r>
-            <w:r>
-              <w:rPr>
-                <w:rFonts w:ascii="Arial" w:hAnsi="Arial" w:cs="Arial"/>
-              </w:rPr>
-              <w:t> </w:t>
-            </w:r>
-            <w:r>
-              <w:rPr>
-                <w:rFonts w:ascii="Arial" w:hAnsi="Arial" w:cs="Arial" w:hint="eastAsia"/>
-              </w:rPr>
-              <w:t>Graphics Programming</w:t>
-            </w:r>
-          </w:p>
-        </w:tc>
-        <w:tc>
-          <w:tcPr>
-            <w:tcW w:w="2698" w:type="dxa"/>
-          </w:tcPr>
-          <w:p>
-            <w:pPr>
-              <w:tabs>
-                <w:tab w:val="right" w:pos="720"/>
-                <w:tab w:val="right" w:pos="9360"/>
-                <w:tab w:val="right" w:pos="31680"/>
-              </w:tabs>
-              <w:spacing w:line="276" w:lineRule="auto"/>
-              <w:rPr>
-                <w:rFonts w:ascii="Arial" w:hAnsi="Arial" w:cs="Arial"/>
-              </w:rPr>
-            </w:pPr>
-            <w:r>
-              <w:rPr>
-                <w:rFonts w:ascii="Arial" w:hAnsi="Arial" w:cs="Arial"/>
-              </w:rPr>
-              <w:t>•</w:t>
-            </w:r>
-            <w:r>
-              <w:rPr>
-                <w:rFonts w:ascii="Arial" w:hAnsi="Arial" w:cs="Arial"/>
-              </w:rPr>
-              <w:t> </w:t>
-            </w:r>
-            <w:r>
-              <w:rPr>
-                <w:rFonts w:ascii="Arial" w:hAnsi="Arial" w:cs="Arial" w:hint="eastAsia"/>
-              </w:rPr>
-              <w:t>React</w:t>
-            </w:r>
-          </w:p>
-        </w:tc>
-        <w:tc>
-          <w:tcPr>
-            <w:tcW w:w="2698" w:type="dxa"/>
-          </w:tcPr>
-          <w:p>
-            <w:pPr>
-              <w:tabs>
-                <w:tab w:val="right" w:pos="720"/>
-                <w:tab w:val="right" w:pos="9360"/>
-                <w:tab w:val="right" w:pos="31680"/>
-              </w:tabs>
-              <w:spacing w:line="276" w:lineRule="auto"/>
-              <w:rPr>
-                <w:rFonts w:ascii="Arial" w:hAnsi="Arial" w:cs="Arial"/>
-              </w:rPr>
-            </w:pPr>
-            <w:r>
-              <w:rPr>
-                <w:rFonts w:ascii="Arial" w:hAnsi="Arial" w:cs="Arial"/>
-              </w:rPr>
-              <w:t>•</w:t>
-            </w:r>
-            <w:r>
-              <w:rPr>
-                <w:rFonts w:ascii="Arial" w:hAnsi="Arial" w:cs="Arial"/>
-              </w:rPr>
-              <w:t> </w:t>
-            </w:r>
-            <w:r>
-              <w:rPr>
-                <w:rFonts w:ascii="Arial" w:hAnsi="Arial" w:cs="Arial" w:hint="eastAsia"/>
-              </w:rPr>
-              <w:t>CSS</w:t>
-            </w:r>
-          </w:p>
-        </w:tc>
-      </w:tr>
-      <w:tr>
-        <w:tc>
-          <w:tcPr>
-            <w:tcW w:w="2697" w:type="dxa"/>
-          </w:tcPr>
-          <w:p>
-            <w:pPr>
-              <w:tabs>
-                <w:tab w:val="right" w:pos="720"/>
-                <w:tab w:val="right" w:pos="9360"/>
-                <w:tab w:val="right" w:pos="31680"/>
-              </w:tabs>
-              <w:spacing w:line="276" w:lineRule="auto"/>
-              <w:rPr>
-                <w:rFonts w:ascii="Arial" w:hAnsi="Arial" w:cs="Arial"/>
-              </w:rPr>
-            </w:pPr>
-            <w:r>
-              <w:rPr>
-                <w:rFonts w:ascii="Arial" w:hAnsi="Arial" w:cs="Arial"/>
-              </w:rPr>
-              <w:t>•</w:t>
-            </w:r>
-            <w:r>
-              <w:rPr>
-                <w:rFonts w:ascii="Arial" w:hAnsi="Arial" w:cs="Arial"/>
-              </w:rPr>
-              <w:t> </w:t>
-            </w:r>
-            <w:r>
-              <w:rPr>
-                <w:rFonts w:ascii="Arial" w:hAnsi="Arial" w:cs="Arial" w:hint="eastAsia"/>
-              </w:rPr>
-              <w:t xml:space="preserve">Gameplay </w:t>
-            </w:r>
-          </w:p>
-        </w:tc>
-        <w:tc>
-          <w:tcPr>
-            <w:tcW w:w="2697" w:type="dxa"/>
-          </w:tcPr>
-          <w:p>
-            <w:pPr>
-              <w:tabs>
-                <w:tab w:val="right" w:pos="720"/>
-                <w:tab w:val="right" w:pos="9360"/>
-                <w:tab w:val="right" w:pos="31680"/>
-              </w:tabs>
-              <w:spacing w:line="276" w:lineRule="auto"/>
-              <w:rPr>
-                <w:rFonts w:ascii="Arial" w:hAnsi="Arial" w:cs="Arial"/>
-              </w:rPr>
-            </w:pPr>
-            <w:r>
-              <w:rPr>
-                <w:rFonts w:ascii="Arial" w:hAnsi="Arial" w:cs="Arial"/>
-              </w:rPr>
-              <w:t>•</w:t>
-            </w:r>
-            <w:r>
-              <w:rPr>
-                <w:rFonts w:ascii="Arial" w:hAnsi="Arial" w:cs="Arial"/>
-              </w:rPr>
-              <w:t> </w:t>
-            </w:r>
-            <w:r>
-              <w:rPr>
-                <w:rFonts w:ascii="Arial" w:hAnsi="Arial" w:cs="Arial" w:hint="eastAsia"/>
-              </w:rPr>
-              <w:t>Direct3D 11</w:t>
-            </w:r>
-          </w:p>
-        </w:tc>
-        <w:tc>
-          <w:tcPr>
-            <w:tcW w:w="2698" w:type="dxa"/>
-          </w:tcPr>
-          <w:p>
-            <w:pPr>
-              <w:tabs>
-                <w:tab w:val="right" w:pos="720"/>
-                <w:tab w:val="right" w:pos="9360"/>
-                <w:tab w:val="right" w:pos="31680"/>
-              </w:tabs>
-              <w:spacing w:line="276" w:lineRule="auto"/>
-              <w:rPr>
-                <w:rFonts w:ascii="Arial" w:hAnsi="Arial" w:cs="Arial"/>
-              </w:rPr>
-            </w:pPr>
-            <w:r>
-              <w:rPr>
-                <w:rFonts w:ascii="Arial" w:hAnsi="Arial" w:cs="Arial"/>
-              </w:rPr>
-              <w:t>•</w:t>
-            </w:r>
-            <w:r>
-              <w:rPr>
-                <w:rFonts w:ascii="Arial" w:hAnsi="Arial" w:cs="Arial"/>
-              </w:rPr>
-              <w:t> </w:t>
-            </w:r>
-            <w:r>
-              <w:rPr>
-                <w:rFonts w:ascii="Arial" w:hAnsi="Arial" w:cs="Arial" w:hint="eastAsia"/>
-              </w:rPr>
-              <w:t>Frontend</w:t>
-            </w:r>
-          </w:p>
-        </w:tc>
-        <w:tc>
-          <w:tcPr>
-            <w:tcW w:w="2698" w:type="dxa"/>
-          </w:tcPr>
-          <w:p>
-            <w:pPr>
-              <w:tabs>
-                <w:tab w:val="right" w:pos="720"/>
-                <w:tab w:val="right" w:pos="9360"/>
-                <w:tab w:val="right" w:pos="31680"/>
-              </w:tabs>
-              <w:spacing w:line="276" w:lineRule="auto"/>
-              <w:rPr>
-                <w:rFonts w:ascii="Arial" w:hAnsi="Arial" w:cs="Arial"/>
-              </w:rPr>
-            </w:pPr>
-            <w:r>
-              <w:rPr>
-                <w:rFonts w:ascii="Arial" w:hAnsi="Arial" w:cs="Arial"/>
-              </w:rPr>
-              <w:t>•</w:t>
-            </w:r>
-            <w:r>
-              <w:rPr>
-                <w:rFonts w:ascii="Arial" w:hAnsi="Arial" w:cs="Arial"/>
-              </w:rPr>
-              <w:t> </w:t>
-            </w:r>
-            <w:r>
-              <w:rPr>
-                <w:rFonts w:ascii="Arial" w:hAnsi="Arial" w:cs="Arial" w:hint="eastAsia"/>
-              </w:rPr>
-              <w:t>UI / HUD</w:t>
-            </w:r>
-          </w:p>
-        </w:tc>
-      </w:tr>
-      <w:tr>
-        <w:tc>
-          <w:tcPr>
-            <w:tcW w:w="2697" w:type="dxa"/>
-          </w:tcPr>
-          <w:p>
-            <w:pPr>
-              <w:tabs>
-                <w:tab w:val="right" w:pos="720"/>
-                <w:tab w:val="right" w:pos="9360"/>
-                <w:tab w:val="right" w:pos="31680"/>
-              </w:tabs>
-              <w:spacing w:line="276" w:lineRule="auto"/>
-              <w:rPr>
-                <w:rFonts w:ascii="Arial" w:hAnsi="Arial" w:cs="Arial"/>
-              </w:rPr>
-            </w:pPr>
-            <w:r>
-              <w:rPr>
-                <w:rFonts w:ascii="Arial" w:hAnsi="Arial" w:cs="Arial"/>
-              </w:rPr>
-              <w:t>•</w:t>
-            </w:r>
-            <w:r>
-              <w:rPr>
-                <w:rFonts w:ascii="Arial" w:hAnsi="Arial" w:cs="Arial"/>
-              </w:rPr>
-              <w:t> </w:t>
-            </w:r>
-            <w:r>
-              <w:rPr>
-                <w:rFonts w:ascii="Arial" w:hAnsi="Arial" w:cs="Arial" w:hint="eastAsia"/>
-              </w:rPr>
-              <w:t>AI</w:t>
-            </w:r>
-          </w:p>
-        </w:tc>
-        <w:tc>
-          <w:tcPr>
-            <w:tcW w:w="2697" w:type="dxa"/>
-          </w:tcPr>
-          <w:p>
-            <w:pPr>
-              <w:tabs>
-                <w:tab w:val="right" w:pos="720"/>
-                <w:tab w:val="right" w:pos="9360"/>
-                <w:tab w:val="right" w:pos="31680"/>
-              </w:tabs>
-              <w:spacing w:line="276" w:lineRule="auto"/>
-              <w:rPr>
-                <w:rFonts w:ascii="Arial" w:hAnsi="Arial" w:cs="Arial"/>
-              </w:rPr>
-            </w:pPr>
-            <w:r>
-              <w:rPr>
-                <w:rFonts w:ascii="Arial" w:hAnsi="Arial" w:cs="Arial"/>
-              </w:rPr>
-              <w:t>•</w:t>
-            </w:r>
-            <w:r>
-              <w:rPr>
-                <w:rFonts w:ascii="Arial" w:hAnsi="Arial" w:cs="Arial"/>
-              </w:rPr>
-              <w:t> </w:t>
-            </w:r>
-            <w:r>
-              <w:rPr>
-                <w:rFonts w:ascii="Arial" w:hAnsi="Arial" w:cs="Arial" w:hint="eastAsia"/>
-              </w:rPr>
-              <w:t>Physics</w:t>
-            </w:r>
-          </w:p>
-        </w:tc>
-        <w:tc>
-          <w:tcPr>
-            <w:tcW w:w="2698" w:type="dxa"/>
-          </w:tcPr>
-          <w:p>
-            <w:pPr>
-              <w:tabs>
-                <w:tab w:val="right" w:pos="720"/>
-                <w:tab w:val="right" w:pos="9360"/>
-                <w:tab w:val="right" w:pos="31680"/>
-              </w:tabs>
-              <w:spacing w:line="276" w:lineRule="auto"/>
-              <w:rPr>
-                <w:rFonts w:ascii="Arial" w:hAnsi="Arial" w:cs="Arial"/>
-              </w:rPr>
-            </w:pPr>
-            <w:r>
-              <w:rPr>
-                <w:rFonts w:ascii="Arial" w:hAnsi="Arial" w:cs="Arial"/>
-              </w:rPr>
-              <w:t>•</w:t>
-            </w:r>
-            <w:r>
-              <w:rPr>
-                <w:rFonts w:ascii="Arial" w:hAnsi="Arial" w:cs="Arial"/>
-              </w:rPr>
-              <w:t> </w:t>
-            </w:r>
-            <w:r>
-              <w:rPr>
-                <w:rFonts w:ascii="Arial" w:hAnsi="Arial" w:cs="Arial" w:hint="eastAsia"/>
-              </w:rPr>
-              <w:t>Git</w:t>
-            </w:r>
-          </w:p>
-        </w:tc>
-        <w:tc>
-          <w:tcPr>
-            <w:tcW w:w="2698" w:type="dxa"/>
-          </w:tcPr>
-          <w:p>
-            <w:pPr>
-              <w:tabs>
-                <w:tab w:val="right" w:pos="720"/>
-                <w:tab w:val="right" w:pos="9360"/>
-                <w:tab w:val="right" w:pos="31680"/>
-              </w:tabs>
-              <w:spacing w:line="276" w:lineRule="auto"/>
-              <w:rPr>
-                <w:rFonts w:ascii="Arial" w:hAnsi="Arial" w:cs="Arial"/>
-              </w:rPr>
-            </w:pPr>
-            <w:r>
-              <w:rPr>
-                <w:rFonts w:ascii="Arial" w:hAnsi="Arial" w:cs="Arial"/>
-              </w:rPr>
-              <w:t>•</w:t>
-            </w:r>
-            <w:r>
-              <w:rPr>
-                <w:rFonts w:ascii="Arial" w:hAnsi="Arial" w:cs="Arial"/>
-              </w:rPr>
-              <w:t> </w:t>
-            </w:r>
-            <w:r>
-              <w:rPr>
-                <w:rFonts w:ascii="Arial" w:hAnsi="Arial" w:cs="Arial" w:hint="eastAsia"/>
-              </w:rPr>
-              <w:t>State Machines</w:t>
-            </w:r>
-          </w:p>
-        </w:tc>
-      </w:tr>
-    </w:tbl>
+    <w:p>
+      <w:pPr>
+        <w:tabs>
+          <w:tab w:val="right" w:pos="720"/>
+          <w:tab w:val="right" w:pos="9360"/>
+          <w:tab w:val="right" w:pos="31680"/>
+        </w:tabs>
+        <w:spacing w:after="0" w:line="276" w:lineRule="auto"/>
+        <w:rPr>
+          <w:rFonts w:ascii="Arial" w:hAnsi="Arial" w:cs="Arial"/>
+        </w:rPr>
+      </w:pPr>
+      <w:r>
+        <w:rPr>
+          <w:rFonts w:ascii="Arial" w:hAnsi="Arial" w:cs="Arial" w:hint="eastAsia"/>
+          <w:b/>
+          <w:bCs/>
+        </w:rPr>
+        <w:t xml:space="preserve">Languages: </w:t>
+      </w:r>
+      <w:r>
+        <w:rPr>
+          <w:rFonts w:ascii="Arial" w:hAnsi="Arial" w:cs="Arial" w:hint="eastAsia"/>
+        </w:rPr>
+        <w:t xml:space="preserve">C#, C++, </w:t>
+      </w:r>
+      <w:r>
+        <w:rPr>
+          <w:rFonts w:ascii="Arial" w:hAnsi="Arial" w:cs="Arial"/>
+        </w:rPr>
+        <w:t>JavaScript</w:t>
+      </w:r>
+      <w:r>
+        <w:rPr>
+          <w:rFonts w:ascii="Arial" w:hAnsi="Arial" w:cs="Arial" w:hint="eastAsia"/>
+        </w:rPr>
+        <w:t>, HTML/CSS,</w:t>
+      </w:r>
+      <w:r>
+        <w:rPr>
+          <w:rFonts w:ascii="Arial" w:hAnsi="Arial" w:cs="Arial"/>
+        </w:rPr>
+        <w:t xml:space="preserve"> </w:t>
+      </w:r>
+      <w:r>
+        <w:rPr>
+          <w:rFonts w:ascii="Arial" w:hAnsi="Arial" w:cs="Arial" w:hint="eastAsia"/>
+        </w:rPr>
+        <w:t>HLSL</w:t>
+      </w:r>
+    </w:p>
+    <w:p>
+      <w:pPr>
+        <w:tabs>
+          <w:tab w:val="right" w:pos="720"/>
+          <w:tab w:val="right" w:pos="9360"/>
+          <w:tab w:val="right" w:pos="31680"/>
+        </w:tabs>
+        <w:spacing w:after="0" w:line="276" w:lineRule="auto"/>
+        <w:rPr>
+          <w:rFonts w:ascii="Arial" w:hAnsi="Arial" w:cs="Arial"/>
+        </w:rPr>
+      </w:pPr>
+      <w:r>
+        <w:rPr>
+          <w:rFonts w:ascii="Arial" w:hAnsi="Arial" w:cs="Arial" w:hint="eastAsia"/>
+          <w:b/>
+          <w:bCs/>
+        </w:rPr>
+        <w:t>Web:</w:t>
+      </w:r>
+      <w:r>
+        <w:rPr>
+          <w:rFonts w:ascii="Arial" w:hAnsi="Arial" w:cs="Arial" w:hint="eastAsia"/>
+        </w:rPr>
+        <w:t xml:space="preserve"> React, Vite, Tailwind CSS, Responsive UI, API Integration</w:t>
+      </w:r>
+    </w:p>
+    <w:p>
+      <w:pPr>
+        <w:tabs>
+          <w:tab w:val="right" w:pos="720"/>
+          <w:tab w:val="right" w:pos="9360"/>
+          <w:tab w:val="right" w:pos="31680"/>
+        </w:tabs>
+        <w:spacing w:after="0" w:line="276" w:lineRule="auto"/>
+        <w:rPr>
+          <w:rFonts w:ascii="Arial" w:hAnsi="Arial" w:cs="Arial" w:hint="eastAsia"/>
+        </w:rPr>
+      </w:pPr>
+      <w:r>
+        <w:rPr>
+          <w:rFonts w:ascii="Arial" w:hAnsi="Arial" w:cs="Arial" w:hint="eastAsia"/>
+          <w:b/>
+          <w:bCs/>
+        </w:rPr>
+        <w:t>Game/Graphics:</w:t>
+      </w:r>
+      <w:r>
+        <w:rPr>
+          <w:rFonts w:ascii="Arial" w:hAnsi="Arial" w:cs="Arial" w:hint="eastAsia"/>
+        </w:rPr>
+        <w:t xml:space="preserve"> Unity, Direct3D11, Gameplay Programming, AI, State Machines, UI/UX</w:t>
+      </w:r>
+    </w:p>
+    <w:p>
+      <w:pPr>
+        <w:tabs>
+          <w:tab w:val="right" w:pos="720"/>
+          <w:tab w:val="right" w:pos="9360"/>
+          <w:tab w:val="right" w:pos="31680"/>
+        </w:tabs>
+        <w:spacing w:after="0" w:line="276" w:lineRule="auto"/>
+        <w:rPr>
+          <w:rFonts w:ascii="Arial" w:hAnsi="Arial" w:cs="Arial" w:hint="eastAsia"/>
+        </w:rPr>
+      </w:pPr>
+      <w:r>
+        <w:rPr>
+          <w:rFonts w:ascii="Arial" w:hAnsi="Arial" w:cs="Arial" w:hint="eastAsia"/>
+          <w:b/>
+          <w:bCs/>
+        </w:rPr>
+        <w:t>Tools:</w:t>
+      </w:r>
+      <w:r>
+        <w:rPr>
+          <w:rFonts w:ascii="Arial" w:hAnsi="Arial" w:cs="Arial" w:hint="eastAsia"/>
+        </w:rPr>
+        <w:t xml:space="preserve"> Git, GitHub, Visual Studio, VS Code, Arduino</w:t>
+      </w:r>
+    </w:p>
     <w:p>
       <w:pPr>
         <w:tabs>

</xml_diff>

<commit_message>
Update portfolio for graduate job search
</commit_message>
<xml_diff>
--- a/src/assets/resumes/Hyunwoo_Park_Resume.docx
+++ b/src/assets/resumes/Hyunwoo_Park_Resume.docx
@@ -225,13 +225,13 @@
         <w:rPr>
           <w:rFonts w:ascii="Arial" w:hAnsi="Arial" w:cs="Arial"/>
         </w:rPr>
-        <w:t xml:space="preserve">Seeking a </w:t>
-      </w:r>
-      <w:r>
-        <w:rPr>
-          <w:rFonts w:ascii="Arial" w:hAnsi="Arial" w:cs="Arial" w:hint="eastAsia"/>
-        </w:rPr>
-        <w:t>full-time co-op or internship</w:t>
+        <w:t xml:space="preserve">Seeking </w:t>
+      </w:r>
+      <w:r>
+        <w:rPr>
+          <w:rFonts w:ascii="Arial" w:hAnsi="Arial" w:cs="Arial" w:hint="eastAsia"/>
+        </w:rPr>
+        <w:t>an entry-level role</w:t>
       </w:r>
       <w:r>
         <w:rPr>
@@ -336,7 +336,7 @@
         <w:spacing w:after="0" w:line="276" w:lineRule="auto"/>
         <w:jc w:val="right"/>
         <w:rPr>
-          <w:rFonts w:ascii="Arial" w:hAnsi="Arial" w:cs="Arial"/>
+          <w:rFonts w:ascii="Arial" w:hAnsi="Arial" w:cs="Arial" w:hint="eastAsia"/>
         </w:rPr>
       </w:pPr>
       <w:r>
@@ -358,11 +358,40 @@
           <w:rFonts w:ascii="Arial" w:hAnsi="Arial" w:cs="Arial"/>
         </w:rPr>
         <w:tab/>
-        <w:t>Expected May 202</w:t>
-      </w:r>
-      <w:r>
-        <w:rPr>
-          <w:rFonts w:ascii="Arial" w:hAnsi="Arial" w:cs="Arial"/>
+      </w:r>
+      <w:r>
+        <w:rPr>
+          <w:rFonts w:ascii="Arial" w:hAnsi="Arial" w:cs="Arial"/>
+        </w:rPr>
+        <w:t>August 202</w:t>
+      </w:r>
+      <w:r>
+        <w:rPr>
+          <w:rFonts w:ascii="Arial" w:hAnsi="Arial" w:cs="Arial" w:hint="eastAsia"/>
+        </w:rPr>
+        <w:t>2</w:t>
+      </w:r>
+      <w:r>
+        <w:rPr>
+          <w:rFonts w:ascii="Arial" w:hAnsi="Arial" w:cs="Arial"/>
+        </w:rPr>
+        <w:t xml:space="preserve"> </w:t>
+      </w:r>
+      <w:r>
+        <w:rPr>
+          <w:rFonts w:ascii="Arial" w:hAnsi="Arial" w:cs="Arial" w:hint="eastAsia"/>
+        </w:rPr>
+        <w:t>-</w:t>
+      </w:r>
+      <w:r>
+        <w:rPr>
+          <w:rFonts w:ascii="Arial" w:hAnsi="Arial" w:cs="Arial"/>
+        </w:rPr>
+        <w:t xml:space="preserve"> May 202</w:t>
+      </w:r>
+      <w:r>
+        <w:rPr>
+          <w:rFonts w:ascii="Arial" w:hAnsi="Arial" w:cs="Arial" w:hint="eastAsia"/>
         </w:rPr>
         <w:t>6</w:t>
       </w:r>

</xml_diff>